<commit_message>
Integrate full T×R×τ theoretical framework into Paper 5
Manuscript (v2 updated):
- Define Trust Calibration Space S = [0,1]×[0,1]×Z+
- Add Trust-Reliability Matrix (T×R plane) quadrant framework
- Add Trust Hysteresis concept (asymmetric erosion vs building)
- New Discussion section on hysteresis (60% C1 vs 18% C2 non-adaptation)
- Renumber figures 1-8 with 3 new theoretical figures
- Add Gao & Lee (2006) and Goddard et al. (2012) references

New figures:
- Figure 2: T×R Matrix with 6 GMM class trajectories and quadrants
- Figure 3: 3D T×R×τ Trust Calibration Space with calibration plane
- Figure 4: 5-pattern theoretical predictions for Chess context

Co-Authored-By: Claude Opus 4.6 <noreply@anthropic.com>
</commit_message>
<xml_diff>
--- a/Chess-Puzzle-Analysis/manuscript/paper5_draft_v2.docx
+++ b/Chess-Puzzle-Analysis/manuscript/paper5_draft_v2.docx
@@ -691,13 +691,13 @@
       </w:r>
     </w:p>
     <w:bookmarkEnd w:id="10"/>
-    <w:bookmarkStart w:id="11" w:name="X9a95f2ceb2fb51ed0f773db42bd39749779ac1b"/>
+    <w:bookmarkStart w:id="13" w:name="the-trust-calibration-space"/>
     <w:p>
       <w:pPr>
         <w:pStyle w:val="Heading2"/>
       </w:pPr>
       <w:r>
-        <w:t xml:space="preserve">Five Theoretically Derived Trajectory Patterns</w:t>
+        <w:t xml:space="preserve">The Trust Calibration Space</w:t>
       </w:r>
     </w:p>
     <w:p>
@@ -705,14 +705,1004 @@
         <w:pStyle w:val="FirstParagraph"/>
       </w:pPr>
       <w:r>
-        <w:t xml:space="preserve">This model predicts five distinct trajectory patterns based on different configurations of the learning rate parameters:</w:t>
-      </w:r>
-    </w:p>
-    <w:p>
-      <w:pPr>
+        <w:t xml:space="preserve">To formalize the dynamics of trust calibration, we define the Trust Calibration Space</w:t>
+      </w:r>
+      <w:r>
+        <w:t xml:space="preserve"> </w:t>
+      </w:r>
+      <m:oMath>
+        <m:r>
+          <m:rPr>
+            <m:scr m:val="script"/>
+            <m:sty m:val="p"/>
+          </m:rPr>
+          <m:t>S</m:t>
+        </m:r>
+        <m:r>
+          <m:rPr>
+            <m:sty m:val="p"/>
+          </m:rPr>
+          <m:t>=</m:t>
+        </m:r>
+        <m:r>
+          <m:rPr>
+            <m:sty m:val="p"/>
+          </m:rPr>
+          <m:t>[</m:t>
+        </m:r>
+        <m:r>
+          <m:t>0</m:t>
+        </m:r>
+        <m:r>
+          <m:rPr>
+            <m:sty m:val="p"/>
+          </m:rPr>
+          <m:t>,</m:t>
+        </m:r>
+        <m:r>
+          <m:t>1</m:t>
+        </m:r>
+        <m:r>
+          <m:rPr>
+            <m:sty m:val="p"/>
+          </m:rPr>
+          <m:t>]</m:t>
+        </m:r>
+        <m:r>
+          <m:rPr>
+            <m:sty m:val="p"/>
+          </m:rPr>
+          <m:t>×</m:t>
+        </m:r>
+        <m:r>
+          <m:rPr>
+            <m:sty m:val="p"/>
+          </m:rPr>
+          <m:t>[</m:t>
+        </m:r>
+        <m:r>
+          <m:t>0</m:t>
+        </m:r>
+        <m:r>
+          <m:rPr>
+            <m:sty m:val="p"/>
+          </m:rPr>
+          <m:t>,</m:t>
+        </m:r>
+        <m:r>
+          <m:t>1</m:t>
+        </m:r>
+        <m:r>
+          <m:rPr>
+            <m:sty m:val="p"/>
+          </m:rPr>
+          <m:t>]</m:t>
+        </m:r>
+        <m:r>
+          <m:rPr>
+            <m:sty m:val="p"/>
+          </m:rPr>
+          <m:t>×</m:t>
+        </m:r>
+        <m:sSup>
+          <m:e>
+            <m:r>
+              <m:rPr>
+                <m:scr m:val="double-struck"/>
+                <m:sty m:val="p"/>
+              </m:rPr>
+              <m:t>Z</m:t>
+            </m:r>
+          </m:e>
+          <m:sup>
+            <m:r>
+              <m:rPr>
+                <m:sty m:val="p"/>
+              </m:rPr>
+              <m:t>+</m:t>
+            </m:r>
+          </m:sup>
+        </m:sSup>
+      </m:oMath>
+      <w:r>
+        <w:t xml:space="preserve"> </w:t>
+      </w:r>
+      <w:r>
+        <w:t xml:space="preserve">as a three-dimensional space characterized by:</w:t>
+      </w:r>
+    </w:p>
+    <w:p>
+      <w:pPr>
+        <w:pStyle w:val="Compact"/>
         <w:numPr>
           <w:ilvl w:val="0"/>
           <w:numId w:val="1001"/>
+        </w:numPr>
+      </w:pPr>
+      <m:oMath>
+        <m:sSub>
+          <m:e>
+            <m:r>
+              <m:t>T</m:t>
+            </m:r>
+          </m:e>
+          <m:sub>
+            <m:r>
+              <m:t>t</m:t>
+            </m:r>
+          </m:sub>
+        </m:sSub>
+        <m:r>
+          <m:rPr>
+            <m:sty m:val="p"/>
+          </m:rPr>
+          <m:t>∈</m:t>
+        </m:r>
+        <m:r>
+          <m:rPr>
+            <m:sty m:val="p"/>
+          </m:rPr>
+          <m:t>[</m:t>
+        </m:r>
+        <m:r>
+          <m:t>0</m:t>
+        </m:r>
+        <m:r>
+          <m:rPr>
+            <m:sty m:val="p"/>
+          </m:rPr>
+          <m:t>,</m:t>
+        </m:r>
+        <m:r>
+          <m:t>1</m:t>
+        </m:r>
+        <m:r>
+          <m:rPr>
+            <m:sty m:val="p"/>
+          </m:rPr>
+          <m:t>]</m:t>
+        </m:r>
+      </m:oMath>
+      <w:r>
+        <w:t xml:space="preserve">: Behavioral trust at time</w:t>
+      </w:r>
+      <w:r>
+        <w:t xml:space="preserve"> </w:t>
+      </w:r>
+      <w:r>
+        <w:rPr>
+          <w:i/>
+          <w:iCs/>
+        </w:rPr>
+        <w:t xml:space="preserve">t</w:t>
+      </w:r>
+      <w:r>
+        <w:t xml:space="preserve">, operationalized as behavioral reliance rate</w:t>
+      </w:r>
+      <w:r>
+        <w:t xml:space="preserve"> </w:t>
+      </w:r>
+      <w:r>
+        <w:rPr>
+          <w:i/>
+          <w:iCs/>
+        </w:rPr>
+        <w:t xml:space="preserve">R</w:t>
+      </w:r>
+      <w:r>
+        <w:rPr>
+          <w:vertAlign w:val="subscript"/>
+        </w:rPr>
+        <w:t xml:space="preserve">b</w:t>
+      </w:r>
+      <w:r>
+        <w:t xml:space="preserve">.</w:t>
+      </w:r>
+    </w:p>
+    <w:p>
+      <w:pPr>
+        <w:pStyle w:val="Compact"/>
+        <w:numPr>
+          <w:ilvl w:val="0"/>
+          <w:numId w:val="1001"/>
+        </w:numPr>
+      </w:pPr>
+      <m:oMath>
+        <m:sSub>
+          <m:e>
+            <m:r>
+              <m:t>R</m:t>
+            </m:r>
+          </m:e>
+          <m:sub>
+            <m:r>
+              <m:t>t</m:t>
+            </m:r>
+          </m:sub>
+        </m:sSub>
+        <m:r>
+          <m:rPr>
+            <m:sty m:val="p"/>
+          </m:rPr>
+          <m:t>∈</m:t>
+        </m:r>
+        <m:r>
+          <m:rPr>
+            <m:sty m:val="p"/>
+          </m:rPr>
+          <m:t>[</m:t>
+        </m:r>
+        <m:r>
+          <m:t>0</m:t>
+        </m:r>
+        <m:r>
+          <m:rPr>
+            <m:sty m:val="p"/>
+          </m:rPr>
+          <m:t>,</m:t>
+        </m:r>
+        <m:r>
+          <m:t>1</m:t>
+        </m:r>
+        <m:r>
+          <m:rPr>
+            <m:sty m:val="p"/>
+          </m:rPr>
+          <m:t>]</m:t>
+        </m:r>
+      </m:oMath>
+      <w:r>
+        <w:t xml:space="preserve">: AI reliability at time</w:t>
+      </w:r>
+      <w:r>
+        <w:t xml:space="preserve"> </w:t>
+      </w:r>
+      <w:r>
+        <w:rPr>
+          <w:i/>
+          <w:iCs/>
+        </w:rPr>
+        <w:t xml:space="preserve">t</w:t>
+      </w:r>
+      <w:r>
+        <w:t xml:space="preserve">, operationalized as AI accuracy</w:t>
+      </w:r>
+      <w:r>
+        <w:t xml:space="preserve"> </w:t>
+      </w:r>
+      <w:r>
+        <w:rPr>
+          <w:i/>
+          <w:iCs/>
+        </w:rPr>
+        <w:t xml:space="preserve">P</w:t>
+      </w:r>
+      <w:r>
+        <w:t xml:space="preserve">.</w:t>
+      </w:r>
+    </w:p>
+    <w:p>
+      <w:pPr>
+        <w:pStyle w:val="Compact"/>
+        <w:numPr>
+          <w:ilvl w:val="0"/>
+          <w:numId w:val="1001"/>
+        </w:numPr>
+      </w:pPr>
+      <m:oMath>
+        <m:r>
+          <m:t>τ</m:t>
+        </m:r>
+        <m:r>
+          <m:rPr>
+            <m:sty m:val="p"/>
+          </m:rPr>
+          <m:t>∈</m:t>
+        </m:r>
+        <m:sSup>
+          <m:e>
+            <m:r>
+              <m:rPr>
+                <m:scr m:val="double-struck"/>
+                <m:sty m:val="p"/>
+              </m:rPr>
+              <m:t>Z</m:t>
+            </m:r>
+          </m:e>
+          <m:sup>
+            <m:r>
+              <m:rPr>
+                <m:sty m:val="p"/>
+              </m:rPr>
+              <m:t>+</m:t>
+            </m:r>
+          </m:sup>
+        </m:sSup>
+      </m:oMath>
+      <w:r>
+        <w:t xml:space="preserve">: Discrete time index representing sequential interaction windows.</w:t>
+      </w:r>
+    </w:p>
+    <w:p>
+      <w:pPr>
+        <w:pStyle w:val="FirstParagraph"/>
+      </w:pPr>
+      <w:r>
+        <w:t xml:space="preserve">The calibration gap at time</w:t>
+      </w:r>
+      <w:r>
+        <w:t xml:space="preserve"> </w:t>
+      </w:r>
+      <w:r>
+        <w:rPr>
+          <w:i/>
+          <w:iCs/>
+        </w:rPr>
+        <w:t xml:space="preserve">t</w:t>
+      </w:r>
+      <w:r>
+        <w:t xml:space="preserve"> </w:t>
+      </w:r>
+      <w:r>
+        <w:t xml:space="preserve">is defined as</w:t>
+      </w:r>
+      <w:r>
+        <w:t xml:space="preserve"> </w:t>
+      </w:r>
+      <m:oMath>
+        <m:sSub>
+          <m:e>
+            <m:r>
+              <m:t>G</m:t>
+            </m:r>
+          </m:e>
+          <m:sub>
+            <m:r>
+              <m:t>t</m:t>
+            </m:r>
+          </m:sub>
+        </m:sSub>
+        <m:r>
+          <m:rPr>
+            <m:sty m:val="p"/>
+          </m:rPr>
+          <m:t>=</m:t>
+        </m:r>
+        <m:sSub>
+          <m:e>
+            <m:r>
+              <m:t>T</m:t>
+            </m:r>
+          </m:e>
+          <m:sub>
+            <m:r>
+              <m:t>t</m:t>
+            </m:r>
+          </m:sub>
+        </m:sSub>
+        <m:r>
+          <m:rPr>
+            <m:sty m:val="p"/>
+          </m:rPr>
+          <m:t>−</m:t>
+        </m:r>
+        <m:sSub>
+          <m:e>
+            <m:r>
+              <m:t>R</m:t>
+            </m:r>
+          </m:e>
+          <m:sub>
+            <m:r>
+              <m:t>t</m:t>
+            </m:r>
+          </m:sub>
+        </m:sSub>
+      </m:oMath>
+      <w:r>
+        <w:t xml:space="preserve">, where</w:t>
+      </w:r>
+      <w:r>
+        <w:t xml:space="preserve"> </w:t>
+      </w:r>
+      <m:oMath>
+        <m:r>
+          <m:t>G</m:t>
+        </m:r>
+        <m:r>
+          <m:rPr>
+            <m:sty m:val="p"/>
+          </m:rPr>
+          <m:t>&gt;</m:t>
+        </m:r>
+        <m:r>
+          <m:t>0</m:t>
+        </m:r>
+      </m:oMath>
+      <w:r>
+        <w:t xml:space="preserve"> </w:t>
+      </w:r>
+      <w:r>
+        <w:t xml:space="preserve">indicates over-reliance (behavioral trust exceeds AI capability),</w:t>
+      </w:r>
+      <w:r>
+        <w:t xml:space="preserve"> </w:t>
+      </w:r>
+      <m:oMath>
+        <m:r>
+          <m:t>G</m:t>
+        </m:r>
+        <m:r>
+          <m:rPr>
+            <m:sty m:val="p"/>
+          </m:rPr>
+          <m:t>&lt;</m:t>
+        </m:r>
+        <m:r>
+          <m:t>0</m:t>
+        </m:r>
+      </m:oMath>
+      <w:r>
+        <w:t xml:space="preserve"> </w:t>
+      </w:r>
+      <w:r>
+        <w:t xml:space="preserve">indicates under-reliance (behavioral trust falls below AI capability), and</w:t>
+      </w:r>
+      <w:r>
+        <w:t xml:space="preserve"> </w:t>
+      </w:r>
+      <m:oMath>
+        <m:r>
+          <m:t>G</m:t>
+        </m:r>
+        <m:r>
+          <m:rPr>
+            <m:sty m:val="p"/>
+          </m:rPr>
+          <m:t>=</m:t>
+        </m:r>
+        <m:r>
+          <m:t>0</m:t>
+        </m:r>
+      </m:oMath>
+      <w:r>
+        <w:t xml:space="preserve"> </w:t>
+      </w:r>
+      <w:r>
+        <w:t xml:space="preserve">represents perfect calibration. A trust trajectory is thus a path through this three-dimensional space,</w:t>
+      </w:r>
+      <w:r>
+        <w:t xml:space="preserve"> </w:t>
+      </w:r>
+      <m:oMath>
+        <m:r>
+          <m:rPr>
+            <m:sty m:val="p"/>
+          </m:rPr>
+          <m:t>{</m:t>
+        </m:r>
+        <m:r>
+          <m:rPr>
+            <m:sty m:val="p"/>
+          </m:rPr>
+          <m:t>(</m:t>
+        </m:r>
+        <m:sSub>
+          <m:e>
+            <m:r>
+              <m:t>T</m:t>
+            </m:r>
+          </m:e>
+          <m:sub>
+            <m:r>
+              <m:t>t</m:t>
+            </m:r>
+          </m:sub>
+        </m:sSub>
+        <m:r>
+          <m:rPr>
+            <m:sty m:val="p"/>
+          </m:rPr>
+          <m:t>,</m:t>
+        </m:r>
+        <m:sSub>
+          <m:e>
+            <m:r>
+              <m:t>R</m:t>
+            </m:r>
+          </m:e>
+          <m:sub>
+            <m:r>
+              <m:t>t</m:t>
+            </m:r>
+          </m:sub>
+        </m:sSub>
+        <m:r>
+          <m:rPr>
+            <m:sty m:val="p"/>
+          </m:rPr>
+          <m:t>,</m:t>
+        </m:r>
+        <m:r>
+          <m:t>τ</m:t>
+        </m:r>
+        <m:r>
+          <m:rPr>
+            <m:sty m:val="p"/>
+          </m:rPr>
+          <m:t>)</m:t>
+        </m:r>
+        <m:sSubSup>
+          <m:e>
+            <m:r>
+              <m:rPr>
+                <m:sty m:val="p"/>
+              </m:rPr>
+              <m:t>}</m:t>
+            </m:r>
+          </m:e>
+          <m:sub>
+            <m:r>
+              <m:t>t</m:t>
+            </m:r>
+            <m:r>
+              <m:rPr>
+                <m:sty m:val="p"/>
+              </m:rPr>
+              <m:t>=</m:t>
+            </m:r>
+            <m:r>
+              <m:t>1</m:t>
+            </m:r>
+          </m:sub>
+          <m:sup>
+            <m:r>
+              <m:t>N</m:t>
+            </m:r>
+          </m:sup>
+        </m:sSubSup>
+      </m:oMath>
+      <w:r>
+        <w:t xml:space="preserve">, and the goal of trust calibration research is to characterize the geometry and dynamics of these paths.</w:t>
+      </w:r>
+    </w:p>
+    <w:bookmarkStart w:id="11" w:name="the-trust-reliability-matrix"/>
+    <w:p>
+      <w:pPr>
+        <w:pStyle w:val="Heading3"/>
+      </w:pPr>
+      <w:r>
+        <w:t xml:space="preserve">The Trust-Reliability Matrix</w:t>
+      </w:r>
+    </w:p>
+    <w:p>
+      <w:pPr>
+        <w:pStyle w:val="FirstParagraph"/>
+      </w:pPr>
+      <w:r>
+        <w:t xml:space="preserve">In the</w:t>
+      </w:r>
+      <w:r>
+        <w:t xml:space="preserve"> </w:t>
+      </w:r>
+      <m:oMath>
+        <m:r>
+          <m:t>T</m:t>
+        </m:r>
+        <m:r>
+          <m:rPr>
+            <m:sty m:val="p"/>
+          </m:rPr>
+          <m:t>×</m:t>
+        </m:r>
+        <m:r>
+          <m:t>R</m:t>
+        </m:r>
+      </m:oMath>
+      <w:r>
+        <w:t xml:space="preserve"> </w:t>
+      </w:r>
+      <w:r>
+        <w:t xml:space="preserve">plane (collapsing across time), four theoretically meaningful regions emerge relative to the identity diagonal</w:t>
+      </w:r>
+      <w:r>
+        <w:t xml:space="preserve"> </w:t>
+      </w:r>
+      <m:oMath>
+        <m:r>
+          <m:t>T</m:t>
+        </m:r>
+        <m:r>
+          <m:rPr>
+            <m:sty m:val="p"/>
+          </m:rPr>
+          <m:t>=</m:t>
+        </m:r>
+        <m:r>
+          <m:t>R</m:t>
+        </m:r>
+      </m:oMath>
+      <w:r>
+        <w:t xml:space="preserve">:</w:t>
+      </w:r>
+    </w:p>
+    <w:p>
+      <w:pPr>
+        <w:pStyle w:val="Compact"/>
+        <w:numPr>
+          <w:ilvl w:val="0"/>
+          <w:numId w:val="1002"/>
+        </w:numPr>
+      </w:pPr>
+      <w:r>
+        <w:rPr>
+          <w:b/>
+          <w:bCs/>
+        </w:rPr>
+        <w:t xml:space="preserve">Calibrated</w:t>
+      </w:r>
+      <w:r>
+        <w:t xml:space="preserve"> </w:t>
+      </w:r>
+      <w:r>
+        <w:t xml:space="preserve">(</w:t>
+      </w:r>
+      <m:oMath>
+        <m:r>
+          <m:t>T</m:t>
+        </m:r>
+        <m:r>
+          <m:rPr>
+            <m:sty m:val="p"/>
+          </m:rPr>
+          <m:t>≈</m:t>
+        </m:r>
+        <m:r>
+          <m:t>R</m:t>
+        </m:r>
+      </m:oMath>
+      <w:r>
+        <w:t xml:space="preserve">): Behavioral reliance is appropriately matched to AI capability, falling near the diagonal.</w:t>
+      </w:r>
+    </w:p>
+    <w:p>
+      <w:pPr>
+        <w:pStyle w:val="Compact"/>
+        <w:numPr>
+          <w:ilvl w:val="0"/>
+          <w:numId w:val="1002"/>
+        </w:numPr>
+      </w:pPr>
+      <w:r>
+        <w:rPr>
+          <w:b/>
+          <w:bCs/>
+        </w:rPr>
+        <w:t xml:space="preserve">Over-reliance</w:t>
+      </w:r>
+      <w:r>
+        <w:t xml:space="preserve"> </w:t>
+      </w:r>
+      <w:r>
+        <w:t xml:space="preserve">(</w:t>
+      </w:r>
+      <m:oMath>
+        <m:r>
+          <m:t>T</m:t>
+        </m:r>
+        <m:r>
+          <m:rPr>
+            <m:sty m:val="p"/>
+          </m:rPr>
+          <m:t>&gt;</m:t>
+        </m:r>
+        <m:r>
+          <m:t>R</m:t>
+        </m:r>
+      </m:oMath>
+      <w:r>
+        <w:t xml:space="preserve">): Behavioral trust exceeds AI capability, located above the diagonal.</w:t>
+      </w:r>
+    </w:p>
+    <w:p>
+      <w:pPr>
+        <w:pStyle w:val="Compact"/>
+        <w:numPr>
+          <w:ilvl w:val="0"/>
+          <w:numId w:val="1002"/>
+        </w:numPr>
+      </w:pPr>
+      <w:r>
+        <w:rPr>
+          <w:b/>
+          <w:bCs/>
+        </w:rPr>
+        <w:t xml:space="preserve">Under-reliance</w:t>
+      </w:r>
+      <w:r>
+        <w:t xml:space="preserve"> </w:t>
+      </w:r>
+      <w:r>
+        <w:t xml:space="preserve">(</w:t>
+      </w:r>
+      <m:oMath>
+        <m:r>
+          <m:t>T</m:t>
+        </m:r>
+        <m:r>
+          <m:rPr>
+            <m:sty m:val="p"/>
+          </m:rPr>
+          <m:t>&lt;</m:t>
+        </m:r>
+        <m:r>
+          <m:t>R</m:t>
+        </m:r>
+      </m:oMath>
+      <w:r>
+        <w:t xml:space="preserve">): Behavioral trust falls below AI capability, located below the diagonal.</w:t>
+      </w:r>
+    </w:p>
+    <w:p>
+      <w:pPr>
+        <w:pStyle w:val="FirstParagraph"/>
+      </w:pPr>
+      <w:r>
+        <w:t xml:space="preserve">The experimental design creates a powerful test of this framework: C1 (High-to-Low) forces participants from the calibrated region toward potential over-reliance as reliability drops, while C2 (Low-to-High) forces participants toward potential under-reliance as reliability increases. Whether and how quickly participants recalibrate—returning to the diagonal—reveals their trust updating characteristics. Figure 2 illustrates this matrix with the chess GMM trajectory data projected into the</w:t>
+      </w:r>
+      <w:r>
+        <w:t xml:space="preserve"> </w:t>
+      </w:r>
+      <m:oMath>
+        <m:r>
+          <m:t>T</m:t>
+        </m:r>
+        <m:r>
+          <m:rPr>
+            <m:sty m:val="p"/>
+          </m:rPr>
+          <m:t>×</m:t>
+        </m:r>
+        <m:r>
+          <m:t>R</m:t>
+        </m:r>
+      </m:oMath>
+      <w:r>
+        <w:t xml:space="preserve"> </w:t>
+      </w:r>
+      <w:r>
+        <w:t xml:space="preserve">plane.</w:t>
+      </w:r>
+    </w:p>
+    <w:bookmarkEnd w:id="11"/>
+    <w:bookmarkStart w:id="12" w:name="trust-hysteresis"/>
+    <w:p>
+      <w:pPr>
+        <w:pStyle w:val="Heading3"/>
+      </w:pPr>
+      <w:r>
+        <w:t xml:space="preserve">Trust Hysteresis</w:t>
+      </w:r>
+    </w:p>
+    <w:p>
+      <w:pPr>
+        <w:pStyle w:val="FirstParagraph"/>
+      </w:pPr>
+      <w:r>
+        <w:t xml:space="preserve">A key prediction from the asymmetric learning rate model (</w:t>
+      </w:r>
+      <m:oMath>
+        <m:sSup>
+          <m:e>
+            <m:r>
+              <m:t>α</m:t>
+            </m:r>
+          </m:e>
+          <m:sup>
+            <m:r>
+              <m:rPr>
+                <m:sty m:val="p"/>
+              </m:rPr>
+              <m:t>+</m:t>
+            </m:r>
+          </m:sup>
+        </m:sSup>
+        <m:r>
+          <m:rPr>
+            <m:sty m:val="p"/>
+          </m:rPr>
+          <m:t>≠</m:t>
+        </m:r>
+        <m:sSup>
+          <m:e>
+            <m:r>
+              <m:t>α</m:t>
+            </m:r>
+          </m:e>
+          <m:sup>
+            <m:r>
+              <m:rPr>
+                <m:sty m:val="p"/>
+              </m:rPr>
+              <m:t>−</m:t>
+            </m:r>
+          </m:sup>
+        </m:sSup>
+      </m:oMath>
+      <w:r>
+        <w:t xml:space="preserve">) is trust hysteresis: the path of trust erosion (when</w:t>
+      </w:r>
+      <w:r>
+        <w:t xml:space="preserve"> </w:t>
+      </w:r>
+      <w:r>
+        <w:rPr>
+          <w:i/>
+          <w:iCs/>
+        </w:rPr>
+        <w:t xml:space="preserve">R</w:t>
+      </w:r>
+      <w:r>
+        <w:t xml:space="preserve"> </w:t>
+      </w:r>
+      <w:r>
+        <w:t xml:space="preserve">decreases) differs from the path of trust building (when</w:t>
+      </w:r>
+      <w:r>
+        <w:t xml:space="preserve"> </w:t>
+      </w:r>
+      <w:r>
+        <w:rPr>
+          <w:i/>
+          <w:iCs/>
+        </w:rPr>
+        <w:t xml:space="preserve">R</w:t>
+      </w:r>
+      <w:r>
+        <w:t xml:space="preserve"> </w:t>
+      </w:r>
+      <w:r>
+        <w:t xml:space="preserve">increases). Specifically, when</w:t>
+      </w:r>
+      <w:r>
+        <w:t xml:space="preserve"> </w:t>
+      </w:r>
+      <m:oMath>
+        <m:sSup>
+          <m:e>
+            <m:r>
+              <m:t>α</m:t>
+            </m:r>
+          </m:e>
+          <m:sup>
+            <m:r>
+              <m:rPr>
+                <m:sty m:val="p"/>
+              </m:rPr>
+              <m:t>−</m:t>
+            </m:r>
+          </m:sup>
+        </m:sSup>
+        <m:r>
+          <m:rPr>
+            <m:sty m:val="p"/>
+          </m:rPr>
+          <m:t>&gt;</m:t>
+        </m:r>
+        <m:sSup>
+          <m:e>
+            <m:r>
+              <m:t>α</m:t>
+            </m:r>
+          </m:e>
+          <m:sup>
+            <m:r>
+              <m:rPr>
+                <m:sty m:val="p"/>
+              </m:rPr>
+              <m:t>+</m:t>
+            </m:r>
+          </m:sup>
+        </m:sSup>
+      </m:oMath>
+      <w:r>
+        <w:t xml:space="preserve"> </w:t>
+      </w:r>
+      <w:r>
+        <w:t xml:space="preserve">(the canonical expectation from Lee &amp; Moray, 1992), trust erodes faster than it builds, creating a hysteresis loop in the</w:t>
+      </w:r>
+      <w:r>
+        <w:t xml:space="preserve"> </w:t>
+      </w:r>
+      <m:oMath>
+        <m:r>
+          <m:t>T</m:t>
+        </m:r>
+        <m:r>
+          <m:rPr>
+            <m:sty m:val="p"/>
+          </m:rPr>
+          <m:t>×</m:t>
+        </m:r>
+        <m:r>
+          <m:t>R</m:t>
+        </m:r>
+      </m:oMath>
+      <w:r>
+        <w:t xml:space="preserve"> </w:t>
+      </w:r>
+      <w:r>
+        <w:t xml:space="preserve">space. Conversely, when automation complacency dominates (</w:t>
+      </w:r>
+      <m:oMath>
+        <m:sSup>
+          <m:e>
+            <m:r>
+              <m:t>α</m:t>
+            </m:r>
+          </m:e>
+          <m:sup>
+            <m:r>
+              <m:rPr>
+                <m:sty m:val="p"/>
+              </m:rPr>
+              <m:t>−</m:t>
+            </m:r>
+          </m:sup>
+        </m:sSup>
+        <m:r>
+          <m:rPr>
+            <m:sty m:val="p"/>
+          </m:rPr>
+          <m:t>≈</m:t>
+        </m:r>
+        <m:r>
+          <m:t>0</m:t>
+        </m:r>
+      </m:oMath>
+      <w:r>
+        <w:t xml:space="preserve">), the erosion path is nearly flat while the building path shows gradual increase. The experimental design with its explicit reliability switch—and the contrasting C1 and C2 conditions—provides a direct test of this asymmetry, as the same participants experience both trust erosion and trust building contexts. Figure 3 visualizes the full three-dimensional trajectories in the Trust Calibration Space</w:t>
+      </w:r>
+      <w:r>
+        <w:t xml:space="preserve"> </w:t>
+      </w:r>
+      <m:oMath>
+        <m:r>
+          <m:rPr>
+            <m:scr m:val="script"/>
+            <m:sty m:val="p"/>
+          </m:rPr>
+          <m:t>S</m:t>
+        </m:r>
+      </m:oMath>
+      <w:r>
+        <w:t xml:space="preserve">.</w:t>
+      </w:r>
+    </w:p>
+    <w:bookmarkEnd w:id="12"/>
+    <w:bookmarkEnd w:id="13"/>
+    <w:bookmarkStart w:id="14" w:name="X9a95f2ceb2fb51ed0f773db42bd39749779ac1b"/>
+    <w:p>
+      <w:pPr>
+        <w:pStyle w:val="Heading2"/>
+      </w:pPr>
+      <w:r>
+        <w:t xml:space="preserve">Five Theoretically Derived Trajectory Patterns</w:t>
+      </w:r>
+    </w:p>
+    <w:p>
+      <w:pPr>
+        <w:pStyle w:val="FirstParagraph"/>
+      </w:pPr>
+      <w:r>
+        <w:t xml:space="preserve">This model predicts five distinct trajectory patterns based on different configurations of the learning rate parameters (see Figure 4 for a visual summary of the theoretical predictions in the chess context):</w:t>
+      </w:r>
+    </w:p>
+    <w:p>
+      <w:pPr>
+        <w:numPr>
+          <w:ilvl w:val="0"/>
+          <w:numId w:val="1003"/>
         </w:numPr>
       </w:pPr>
       <w:r>
@@ -798,7 +1788,7 @@
       <w:pPr>
         <w:numPr>
           <w:ilvl w:val="0"/>
-          <w:numId w:val="1001"/>
+          <w:numId w:val="1003"/>
         </w:numPr>
       </w:pPr>
       <w:r>
@@ -869,7 +1859,7 @@
       <w:pPr>
         <w:numPr>
           <w:ilvl w:val="0"/>
-          <w:numId w:val="1001"/>
+          <w:numId w:val="1003"/>
         </w:numPr>
       </w:pPr>
       <w:r>
@@ -936,7 +1926,7 @@
       <w:pPr>
         <w:numPr>
           <w:ilvl w:val="0"/>
-          <w:numId w:val="1001"/>
+          <w:numId w:val="1003"/>
         </w:numPr>
       </w:pPr>
       <w:r>
@@ -968,7 +1958,7 @@
       <w:pPr>
         <w:numPr>
           <w:ilvl w:val="0"/>
-          <w:numId w:val="1001"/>
+          <w:numId w:val="1003"/>
         </w:numPr>
       </w:pPr>
       <w:r>
@@ -1031,8 +2021,8 @@
         <w:t xml:space="preserve">): When AI reliability improves, the individual fails to increase trust, maintaining under-reliance. The mathematical mirror of the Catastrophic pattern. First identified inductively in exploratory analysis of educational data (You, 2026).</w:t>
       </w:r>
     </w:p>
-    <w:bookmarkEnd w:id="11"/>
-    <w:bookmarkStart w:id="14" w:name="the-present-study"/>
+    <w:bookmarkEnd w:id="14"/>
+    <w:bookmarkStart w:id="17" w:name="the-present-study"/>
     <w:p>
       <w:pPr>
         <w:pStyle w:val="Heading2"/>
@@ -1062,7 +2052,7 @@
         <w:pStyle w:val="Compact"/>
         <w:numPr>
           <w:ilvl w:val="0"/>
-          <w:numId w:val="1002"/>
+          <w:numId w:val="1004"/>
         </w:numPr>
       </w:pPr>
       <w:r>
@@ -1100,7 +2090,7 @@
         <w:pStyle w:val="Compact"/>
         <w:numPr>
           <w:ilvl w:val="0"/>
-          <w:numId w:val="1002"/>
+          <w:numId w:val="1004"/>
         </w:numPr>
       </w:pPr>
       <w:r>
@@ -1133,7 +2123,7 @@
         <w:t xml:space="preserve">based on trajectory features, capturing within-condition heterogeneity.</w:t>
       </w:r>
     </w:p>
-    <w:bookmarkStart w:id="12" w:name="research-questions"/>
+    <w:bookmarkStart w:id="15" w:name="research-questions"/>
     <w:p>
       <w:pPr>
         <w:pStyle w:val="Heading3"/>
@@ -1214,8 +2204,8 @@
         <w:t xml:space="preserve">How do LCGA and GMM results relate to each other, and what complementary insights does each method provide?</w:t>
       </w:r>
     </w:p>
-    <w:bookmarkEnd w:id="12"/>
-    <w:bookmarkStart w:id="13" w:name="hypotheses"/>
+    <w:bookmarkEnd w:id="15"/>
+    <w:bookmarkStart w:id="16" w:name="hypotheses"/>
     <w:p>
       <w:pPr>
         <w:pStyle w:val="Heading3"/>
@@ -1321,9 +2311,9 @@
         </w:pict>
       </w:r>
     </w:p>
-    <w:bookmarkEnd w:id="13"/>
-    <w:bookmarkEnd w:id="14"/>
-    <w:bookmarkStart w:id="24" w:name="method"/>
+    <w:bookmarkEnd w:id="16"/>
+    <w:bookmarkEnd w:id="17"/>
+    <w:bookmarkStart w:id="27" w:name="method"/>
     <w:p>
       <w:pPr>
         <w:pStyle w:val="Heading2"/>
@@ -1332,7 +2322,7 @@
         <w:t xml:space="preserve">Method</w:t>
       </w:r>
     </w:p>
-    <w:bookmarkStart w:id="15" w:name="data-source"/>
+    <w:bookmarkStart w:id="18" w:name="data-source"/>
     <w:p>
       <w:pPr>
         <w:pStyle w:val="Heading3"/>
@@ -1349,8 +2339,8 @@
         <w:t xml:space="preserve">We conducted a secondary analysis of the experimental dataset from Bondi et al. (2023). The original study investigated human decision-making in chess puzzles with AI assistance.</w:t>
       </w:r>
     </w:p>
-    <w:bookmarkEnd w:id="15"/>
-    <w:bookmarkStart w:id="16" w:name="participants-and-design"/>
+    <w:bookmarkEnd w:id="18"/>
+    <w:bookmarkStart w:id="19" w:name="participants-and-design"/>
     <w:p>
       <w:pPr>
         <w:pStyle w:val="Heading3"/>
@@ -1383,8 +2373,8 @@
         <w:t xml:space="preserve">= 100 sessions from 50 participants, each completing two sessions in different conditions. The study used a within-subject design with two conditions: C1 (High-to-Low), in which AI accuracy was approximately 80% in Windows 1–4 and then approximately 20% in Windows 5–6; and C2 (Low-to-High), in which AI accuracy was approximately 20% in Windows 1–4 and then approximately 80% in Windows 5–6. Participants selected the best chess move from options, with AI recommendations provided. Each session comprised 30 trials organized into six windows of five trials each. The reliability switch occurred between trials 20 and 21 (between Window 4 and Window 5).</w:t>
       </w:r>
     </w:p>
-    <w:bookmarkEnd w:id="16"/>
-    <w:bookmarkStart w:id="17" w:name="ethical-considerations-and-data-access"/>
+    <w:bookmarkEnd w:id="19"/>
+    <w:bookmarkStart w:id="20" w:name="ethical-considerations-and-data-access"/>
     <w:p>
       <w:pPr>
         <w:pStyle w:val="Heading3"/>
@@ -1401,8 +2391,8 @@
         <w:t xml:space="preserve">The dataset is publicly available from the original authors. Our secondary analysis was pre-registered on the Open Science Framework (OSF; https://doi.org/10.17605/OSF.IO/JMQ84).</w:t>
       </w:r>
     </w:p>
-    <w:bookmarkEnd w:id="17"/>
-    <w:bookmarkStart w:id="18" w:name="measures"/>
+    <w:bookmarkEnd w:id="20"/>
+    <w:bookmarkStart w:id="21" w:name="measures"/>
     <w:p>
       <w:pPr>
         <w:pStyle w:val="Heading3"/>
@@ -1572,8 +2562,8 @@
         <w:t xml:space="preserve">, served as the primary outcome measure. Positive values indicate over-reliance (following AI more than warranted); negative values indicate under-reliance.</w:t>
       </w:r>
     </w:p>
-    <w:bookmarkEnd w:id="18"/>
-    <w:bookmarkStart w:id="23" w:name="analytic-strategy"/>
+    <w:bookmarkEnd w:id="21"/>
+    <w:bookmarkStart w:id="26" w:name="analytic-strategy"/>
     <w:p>
       <w:pPr>
         <w:pStyle w:val="Heading3"/>
@@ -1582,7 +2572,7 @@
         <w:t xml:space="preserve">Analytic Strategy</w:t>
       </w:r>
     </w:p>
-    <w:bookmarkStart w:id="19" w:name="phase-1-descriptive-analysis"/>
+    <w:bookmarkStart w:id="22" w:name="phase-1-descriptive-analysis"/>
     <w:p>
       <w:pPr>
         <w:pStyle w:val="Heading4"/>
@@ -1599,8 +2589,8 @@
         <w:t xml:space="preserve">Window-level descriptive statistics by condition were computed, with particular focus on the switch effect between Windows 4 and 5.</w:t>
       </w:r>
     </w:p>
-    <w:bookmarkEnd w:id="19"/>
-    <w:bookmarkStart w:id="20" w:name="phase-2-latent-class-growth-analysis"/>
+    <w:bookmarkEnd w:id="22"/>
+    <w:bookmarkStart w:id="23" w:name="phase-2-latent-class-growth-analysis"/>
     <w:p>
       <w:pPr>
         <w:pStyle w:val="Heading4"/>
@@ -1900,8 +2890,8 @@
         <w:t xml:space="preserve">(primary), SABIC, and entropy (for classification quality).</w:t>
       </w:r>
     </w:p>
-    <w:bookmarkEnd w:id="20"/>
-    <w:bookmarkStart w:id="21" w:name="X0d227cd6b96255a8ccbf16eaaaba18c51fade57"/>
+    <w:bookmarkEnd w:id="23"/>
+    <w:bookmarkStart w:id="24" w:name="X0d227cd6b96255a8ccbf16eaaaba18c51fade57"/>
     <w:p>
       <w:pPr>
         <w:pStyle w:val="Heading4"/>
@@ -1994,8 +2984,8 @@
         <w:t xml:space="preserve">= 1 through 10).</w:t>
       </w:r>
     </w:p>
-    <w:bookmarkEnd w:id="21"/>
-    <w:bookmarkStart w:id="22" w:name="phase-4-cross-method-comparison"/>
+    <w:bookmarkEnd w:id="24"/>
+    <w:bookmarkStart w:id="25" w:name="phase-4-cross-method-comparison"/>
     <w:p>
       <w:pPr>
         <w:pStyle w:val="Heading4"/>
@@ -2019,10 +3009,10 @@
         </w:pict>
       </w:r>
     </w:p>
-    <w:bookmarkEnd w:id="22"/>
-    <w:bookmarkEnd w:id="23"/>
-    <w:bookmarkEnd w:id="24"/>
-    <w:bookmarkStart w:id="34" w:name="results"/>
+    <w:bookmarkEnd w:id="25"/>
+    <w:bookmarkEnd w:id="26"/>
+    <w:bookmarkEnd w:id="27"/>
+    <w:bookmarkStart w:id="37" w:name="results"/>
     <w:p>
       <w:pPr>
         <w:pStyle w:val="Heading2"/>
@@ -2031,7 +3021,7 @@
         <w:t xml:space="preserve">Results</w:t>
       </w:r>
     </w:p>
-    <w:bookmarkStart w:id="25" w:name="descriptive-results"/>
+    <w:bookmarkStart w:id="28" w:name="descriptive-results"/>
     <w:p>
       <w:pPr>
         <w:pStyle w:val="Heading3"/>
@@ -2180,8 +3170,8 @@
         <w:t xml:space="preserve">| &gt; 2.0), confirming that the reliability switch was a potent experimental manipulation.</w:t>
       </w:r>
     </w:p>
-    <w:bookmarkEnd w:id="25"/>
-    <w:bookmarkStart w:id="28" w:name="lcga-results"/>
+    <w:bookmarkEnd w:id="28"/>
+    <w:bookmarkStart w:id="31" w:name="lcga-results"/>
     <w:p>
       <w:pPr>
         <w:pStyle w:val="Heading3"/>
@@ -2190,7 +3180,7 @@
         <w:t xml:space="preserve">LCGA Results</w:t>
       </w:r>
     </w:p>
-    <w:bookmarkStart w:id="26" w:name="calibration-gap-trajectory-classes"/>
+    <w:bookmarkStart w:id="29" w:name="calibration-gap-trajectory-classes"/>
     <w:p>
       <w:pPr>
         <w:pStyle w:val="Heading4"/>
@@ -2254,11 +3244,11 @@
         <w:t xml:space="preserve"> </w:t>
       </w:r>
       <w:r>
-        <w:t xml:space="preserve">= 48) consisted of 47 C2 and one C1 session. This represents 96% accuracy in condition classification, confirming that the experimental condition is the dominant determinant of the calibration gap trajectory (see Figure 2).</w:t>
-      </w:r>
-    </w:p>
-    <w:bookmarkEnd w:id="26"/>
-    <w:bookmarkStart w:id="27" w:name="behavioral-reliance-trajectory-classes"/>
+        <w:t xml:space="preserve">= 48) consisted of 47 C2 and one C1 session. This represents 96% accuracy in condition classification, confirming that the experimental condition is the dominant determinant of the calibration gap trajectory (see Figure 5).</w:t>
+      </w:r>
+    </w:p>
+    <w:bookmarkEnd w:id="29"/>
+    <w:bookmarkStart w:id="30" w:name="behavioral-reliance-trajectory-classes"/>
     <w:p>
       <w:pPr>
         <w:pStyle w:val="Heading4"/>
@@ -2330,9 +3320,9 @@
         <w:t xml:space="preserve">= 12, one C1 + 11 C2). This supports H5: the calibration gap is a more sensitive indicator of condition effects than raw behavioral reliance.</w:t>
       </w:r>
     </w:p>
-    <w:bookmarkEnd w:id="27"/>
-    <w:bookmarkEnd w:id="28"/>
-    <w:bookmarkStart w:id="31" w:name="gmm-results"/>
+    <w:bookmarkEnd w:id="30"/>
+    <w:bookmarkEnd w:id="31"/>
+    <w:bookmarkStart w:id="34" w:name="gmm-results"/>
     <w:p>
       <w:pPr>
         <w:pStyle w:val="Heading3"/>
@@ -2362,10 +3352,10 @@
         <w:t xml:space="preserve"> </w:t>
       </w:r>
       <w:r>
-        <w:t xml:space="preserve">optimization across all parameterizations. All six classes achieved perfect condition separation (100% C1 or 100% C2 within each class), indicating that condition-driven variance dominated the feature space (see Figure 3 and Table 2).</w:t>
-      </w:r>
-    </w:p>
-    <w:bookmarkStart w:id="29" w:name="c1-high-to-low-subgroups"/>
+        <w:t xml:space="preserve">optimization across all parameterizations. All six classes achieved perfect condition separation (100% C1 or 100% C2 within each class), indicating that condition-driven variance dominated the feature space (see Figure 6 and Table 2). The six GMM classes occupy distinct regions of the Trust-Reliability Matrix (see Figure 2): C1 classes (Catastrophic and Convergent) move from the calibrated diagonal into the over-reliance region as reliability drops, while C2 classes (Convergent, Oscillating, and ABE) move from under-reliance toward the diagonal as reliability increases.</w:t>
+      </w:r>
+    </w:p>
+    <w:bookmarkStart w:id="32" w:name="c1-high-to-low-subgroups"/>
     <w:p>
       <w:pPr>
         <w:pStyle w:val="Heading4"/>
@@ -2635,8 +3625,8 @@
         <w:t xml:space="preserve">; see Table 4).</w:t>
       </w:r>
     </w:p>
-    <w:bookmarkEnd w:id="29"/>
-    <w:bookmarkStart w:id="30" w:name="c2-low-to-high-subgroups"/>
+    <w:bookmarkEnd w:id="32"/>
+    <w:bookmarkStart w:id="33" w:name="c2-low-to-high-subgroups"/>
     <w:p>
       <w:pPr>
         <w:pStyle w:val="Heading4"/>
@@ -2955,9 +3945,9 @@
         <w:t xml:space="preserve">Two sessions showed near-100% AI following regardless of accuracy, representing an extreme case of automation compliance.</w:t>
       </w:r>
     </w:p>
-    <w:bookmarkEnd w:id="30"/>
-    <w:bookmarkEnd w:id="31"/>
-    <w:bookmarkStart w:id="32" w:name="theoretical-pattern-mapping"/>
+    <w:bookmarkEnd w:id="33"/>
+    <w:bookmarkEnd w:id="34"/>
+    <w:bookmarkStart w:id="35" w:name="theoretical-pattern-mapping"/>
     <w:p>
       <w:pPr>
         <w:pStyle w:val="Heading3"/>
@@ -2987,11 +3977,37 @@
         <w:t xml:space="preserve"> </w:t>
       </w:r>
       <w:r>
-        <w:t xml:space="preserve">= 2) represents an additional, theoretically unanticipated extreme case. This mapping is further illustrated in the Bayesian Trust Update Model parameter space (see Figure 4).</w:t>
-      </w:r>
-    </w:p>
-    <w:bookmarkEnd w:id="32"/>
-    <w:bookmarkStart w:id="33" w:name="cross-method-comparison"/>
+        <w:t xml:space="preserve">= 2) represents an additional, theoretically unanticipated extreme case. This mapping is further illustrated in the Bayesian Trust Update Model parameter space (see Figure 7). The full three-dimensional trajectories of each GMM class through the Trust Calibration Space (</w:t>
+      </w:r>
+      <m:oMath>
+        <m:r>
+          <m:t>T</m:t>
+        </m:r>
+        <m:r>
+          <m:rPr>
+            <m:sty m:val="p"/>
+          </m:rPr>
+          <m:t>×</m:t>
+        </m:r>
+        <m:r>
+          <m:t>R</m:t>
+        </m:r>
+        <m:r>
+          <m:rPr>
+            <m:sty m:val="p"/>
+          </m:rPr>
+          <m:t>×</m:t>
+        </m:r>
+        <m:r>
+          <m:t>τ</m:t>
+        </m:r>
+      </m:oMath>
+      <w:r>
+        <w:t xml:space="preserve">) are shown in Figure 3, revealing the distinct geometric paths that each pattern traces through the space.</w:t>
+      </w:r>
+    </w:p>
+    <w:bookmarkEnd w:id="35"/>
+    <w:bookmarkStart w:id="36" w:name="cross-method-comparison"/>
     <w:p>
       <w:pPr>
         <w:pStyle w:val="Heading3"/>
@@ -3031,7 +4047,7 @@
         <w:t xml:space="preserve"> </w:t>
       </w:r>
       <w:r>
-        <w:t xml:space="preserve">= 6) class assignments was ARI = .362, reflecting moderate agreement (see Table 3 and Figure 5). Cross-tabulation revealed that LCGA Class 1 (C1-dominant) comprised GMM Class 1 (Convergent) and GMM Class 5 (Catastrophic), while LCGA Class 2 (C2-dominant) comprised GMM Classes 2, 3, and 4 (Oscillating, Convergent, and ABE, respectively). This confirms that LCGA captures condition-level macro-structure while GMM captures within-condition micro-heterogeneity. The two methods provide complementary, not redundant, information.</w:t>
+        <w:t xml:space="preserve">= 6) class assignments was ARI = .362, reflecting moderate agreement (see Table 3 and Figure 8). Cross-tabulation revealed that LCGA Class 1 (C1-dominant) comprised GMM Class 1 (Convergent) and GMM Class 5 (Catastrophic), while LCGA Class 2 (C2-dominant) comprised GMM Classes 2, 3, and 4 (Oscillating, Convergent, and ABE, respectively). This confirms that LCGA captures condition-level macro-structure while GMM captures within-condition micro-heterogeneity. The two methods provide complementary, not redundant, information.</w:t>
       </w:r>
     </w:p>
     <w:p>
@@ -3041,9 +4057,9 @@
         </w:pict>
       </w:r>
     </w:p>
-    <w:bookmarkEnd w:id="33"/>
-    <w:bookmarkEnd w:id="34"/>
-    <w:bookmarkStart w:id="43" w:name="discussion"/>
+    <w:bookmarkEnd w:id="36"/>
+    <w:bookmarkEnd w:id="37"/>
+    <w:bookmarkStart w:id="47" w:name="discussion"/>
     <w:p>
       <w:pPr>
         <w:pStyle w:val="Heading2"/>
@@ -3052,7 +4068,7 @@
         <w:t xml:space="preserve">Discussion</w:t>
       </w:r>
     </w:p>
-    <w:bookmarkStart w:id="35" w:name="summary-of-findings"/>
+    <w:bookmarkStart w:id="38" w:name="summary-of-findings"/>
     <w:p>
       <w:pPr>
         <w:pStyle w:val="Heading3"/>
@@ -3133,8 +4149,8 @@
         <w:t xml:space="preserve">).</w:t>
       </w:r>
     </w:p>
-    <w:bookmarkEnd w:id="35"/>
-    <w:bookmarkStart w:id="36" w:name="X77c949c5df08a604327b5a5924952110098fec2"/>
+    <w:bookmarkEnd w:id="38"/>
+    <w:bookmarkStart w:id="39" w:name="X77c949c5df08a604327b5a5924952110098fec2"/>
     <w:p>
       <w:pPr>
         <w:pStyle w:val="Heading3"/>
@@ -3263,8 +4279,8 @@
         <w:t xml:space="preserve">This finding extends prior work on automation complacency (Parasuraman et al., 1993) by demonstrating that complacency is not universal but characterizes a majority subgroup (60%), with a substantial minority capable of rapid recalibration.</w:t>
       </w:r>
     </w:p>
-    <w:bookmarkEnd w:id="36"/>
-    <w:bookmarkStart w:id="37" w:name="trust-repair-three-pathways-c2"/>
+    <w:bookmarkEnd w:id="39"/>
+    <w:bookmarkStart w:id="40" w:name="trust-repair-three-pathways-c2"/>
     <w:p>
       <w:pPr>
         <w:pStyle w:val="Heading3"/>
@@ -3286,7 +4302,7 @@
         <w:pStyle w:val="Compact"/>
         <w:numPr>
           <w:ilvl w:val="0"/>
-          <w:numId w:val="1003"/>
+          <w:numId w:val="1005"/>
         </w:numPr>
       </w:pPr>
       <w:r>
@@ -3308,7 +4324,7 @@
         <w:pStyle w:val="Compact"/>
         <w:numPr>
           <w:ilvl w:val="0"/>
-          <w:numId w:val="1003"/>
+          <w:numId w:val="1005"/>
         </w:numPr>
       </w:pPr>
       <w:r>
@@ -3330,7 +4346,7 @@
         <w:pStyle w:val="Compact"/>
         <w:numPr>
           <w:ilvl w:val="0"/>
-          <w:numId w:val="1003"/>
+          <w:numId w:val="1005"/>
         </w:numPr>
       </w:pPr>
       <w:r>
@@ -3437,13 +4453,144 @@
         <w:t xml:space="preserve">phenomenon (Parasuraman &amp; Riley, 1997) and suggests that initial negative experiences can create persistent anchoring effects that override subsequent positive evidence (see also Tversky &amp; Kahneman, 1974).</w:t>
       </w:r>
     </w:p>
-    <w:bookmarkEnd w:id="37"/>
-    <w:bookmarkStart w:id="38" w:name="complementary-methods-lcga-and-gmm"/>
+    <w:bookmarkEnd w:id="40"/>
+    <w:bookmarkStart w:id="41" w:name="Xbbf51ef1090e3dcf83910070deebb63a6b108c8"/>
     <w:p>
       <w:pPr>
         <w:pStyle w:val="Heading3"/>
       </w:pPr>
       <w:r>
+        <w:t xml:space="preserve">Trust Hysteresis: Asymmetric Erosion and Building</w:t>
+      </w:r>
+    </w:p>
+    <w:p>
+      <w:pPr>
+        <w:pStyle w:val="FirstParagraph"/>
+      </w:pPr>
+      <w:r>
+        <w:t xml:space="preserve">The comparison between C1 (trust erosion) and C2 (trust building) reveals a striking asymmetry consistent with trust hysteresis. In C1, 60% of participants showed Catastrophic non-adaptation (</w:t>
+      </w:r>
+      <m:oMath>
+        <m:sSup>
+          <m:e>
+            <m:r>
+              <m:t>α</m:t>
+            </m:r>
+          </m:e>
+          <m:sup>
+            <m:r>
+              <m:rPr>
+                <m:sty m:val="p"/>
+              </m:rPr>
+              <m:t>−</m:t>
+            </m:r>
+          </m:sup>
+        </m:sSup>
+        <m:r>
+          <m:rPr>
+            <m:sty m:val="p"/>
+          </m:rPr>
+          <m:t>≈</m:t>
+        </m:r>
+        <m:r>
+          <m:t>0</m:t>
+        </m:r>
+      </m:oMath>
+      <w:r>
+        <w:t xml:space="preserve">)—they failed to reduce trust when</w:t>
+      </w:r>
+      <w:r>
+        <w:t xml:space="preserve"> </w:t>
+      </w:r>
+      <w:r>
+        <w:rPr>
+          <w:i/>
+          <w:iCs/>
+        </w:rPr>
+        <w:t xml:space="preserve">R</w:t>
+      </w:r>
+      <w:r>
+        <w:t xml:space="preserve"> </w:t>
+      </w:r>
+      <w:r>
+        <w:t xml:space="preserve">dropped. In C2, 50% showed gradual Convergent adaptation but 18% showed ABE non-adaptation (</w:t>
+      </w:r>
+      <m:oMath>
+        <m:sSup>
+          <m:e>
+            <m:r>
+              <m:t>α</m:t>
+            </m:r>
+          </m:e>
+          <m:sup>
+            <m:r>
+              <m:rPr>
+                <m:sty m:val="p"/>
+              </m:rPr>
+              <m:t>+</m:t>
+            </m:r>
+          </m:sup>
+        </m:sSup>
+        <m:r>
+          <m:rPr>
+            <m:sty m:val="p"/>
+          </m:rPr>
+          <m:t>≈</m:t>
+        </m:r>
+        <m:r>
+          <m:t>0</m:t>
+        </m:r>
+      </m:oMath>
+      <w:r>
+        <w:t xml:space="preserve">). The fact that non-adaptation was more prevalent in the erosion direction (60%) than the building direction (18%) is consistent with the canonical trust asymmetry (trust is harder to destroy than to build; Lee &amp; Moray, 1992), but with an important nuance: the Catastrophic pattern represents a failure to</w:t>
+      </w:r>
+      <w:r>
+        <w:t xml:space="preserve"> </w:t>
+      </w:r>
+      <w:r>
+        <w:rPr>
+          <w:i/>
+          <w:iCs/>
+        </w:rPr>
+        <w:t xml:space="preserve">erode</w:t>
+      </w:r>
+      <w:r>
+        <w:t xml:space="preserve"> </w:t>
+      </w:r>
+      <w:r>
+        <w:t xml:space="preserve">trust (the opposite of what standard asymmetry predicts). This suggests that automation complacency (Goddard et al., 2012; Parasuraman et al., 1993) creates an additional barrier to downward recalibration beyond what simple learning rate asymmetry would predict. In decision field theory terms (Gao &amp; Lee, 2006), the subjective evaluation of automation performance may be biased by prior positive experiences, creating an inertial force that resists trust erosion even in the face of clear reliability declines. Figure 2 illustrates these asymmetric paths in the</w:t>
+      </w:r>
+      <w:r>
+        <w:t xml:space="preserve"> </w:t>
+      </w:r>
+      <m:oMath>
+        <m:r>
+          <m:t>T</m:t>
+        </m:r>
+        <m:r>
+          <m:rPr>
+            <m:sty m:val="p"/>
+          </m:rPr>
+          <m:t>×</m:t>
+        </m:r>
+        <m:r>
+          <m:t>R</m:t>
+        </m:r>
+      </m:oMath>
+      <w:r>
+        <w:t xml:space="preserve"> </w:t>
+      </w:r>
+      <w:r>
+        <w:t xml:space="preserve">space, and Figure 3 shows the full trajectories in the three-dimensional Trust Calibration Space.</w:t>
+      </w:r>
+    </w:p>
+    <w:bookmarkEnd w:id="41"/>
+    <w:bookmarkStart w:id="42" w:name="complementary-methods-lcga-and-gmm"/>
+    <w:p>
+      <w:pPr>
+        <w:pStyle w:val="Heading3"/>
+      </w:pPr>
+      <w:r>
         <w:t xml:space="preserve">Complementary Methods: LCGA and GMM</w:t>
       </w:r>
     </w:p>
@@ -3463,8 +4610,8 @@
         <w:t xml:space="preserve">We recommend this complementary approach as a methodological standard for trust trajectory research, as neither method alone captures the full structure of individual differences.</w:t>
       </w:r>
     </w:p>
-    <w:bookmarkEnd w:id="38"/>
-    <w:bookmarkStart w:id="41" w:name="implications-for-ai-system-design"/>
+    <w:bookmarkEnd w:id="42"/>
+    <w:bookmarkStart w:id="45" w:name="implications-for-ai-system-design"/>
     <w:p>
       <w:pPr>
         <w:pStyle w:val="Heading3"/>
@@ -3473,7 +4620,7 @@
         <w:t xml:space="preserve">Implications for AI System Design</w:t>
       </w:r>
     </w:p>
-    <w:bookmarkStart w:id="39" w:name="adaptive-trust-calibration"/>
+    <w:bookmarkStart w:id="43" w:name="adaptive-trust-calibration"/>
     <w:p>
       <w:pPr>
         <w:pStyle w:val="Heading4"/>
@@ -3510,8 +4657,8 @@
         <w:t xml:space="preserve">).</w:t>
       </w:r>
     </w:p>
-    <w:bookmarkEnd w:id="39"/>
-    <w:bookmarkStart w:id="40" w:name="individual-differences-in-trust-updating"/>
+    <w:bookmarkEnd w:id="43"/>
+    <w:bookmarkStart w:id="44" w:name="individual-differences-in-trust-updating"/>
     <w:p>
       <w:pPr>
         <w:pStyle w:val="Heading4"/>
@@ -3586,9 +4733,9 @@
         <w:t xml:space="preserve">) need sustained positive evidence and gradual trust-building scaffolds. Oscillating users may benefit from consistency in AI reliability exposure.</w:t>
       </w:r>
     </w:p>
-    <w:bookmarkEnd w:id="40"/>
-    <w:bookmarkEnd w:id="41"/>
-    <w:bookmarkStart w:id="42" w:name="limitations-and-future-directions"/>
+    <w:bookmarkEnd w:id="44"/>
+    <w:bookmarkEnd w:id="45"/>
+    <w:bookmarkStart w:id="46" w:name="limitations-and-future-directions"/>
     <w:p>
       <w:pPr>
         <w:pStyle w:val="Heading3"/>
@@ -3660,9 +4807,9 @@
         </w:pict>
       </w:r>
     </w:p>
-    <w:bookmarkEnd w:id="42"/>
-    <w:bookmarkEnd w:id="43"/>
-    <w:bookmarkStart w:id="59" w:name="references"/>
+    <w:bookmarkEnd w:id="46"/>
+    <w:bookmarkEnd w:id="47"/>
+    <w:bookmarkStart w:id="72" w:name="references"/>
     <w:p>
       <w:pPr>
         <w:pStyle w:val="Heading2"/>
@@ -3737,6 +4884,74 @@
       </w:r>
       <w:r>
         <w:t xml:space="preserve">(6), 697–718. https://doi.org/10.1016/S1071-5819(03)00038-7</w:t>
+      </w:r>
+    </w:p>
+    <w:p>
+      <w:pPr>
+        <w:pStyle w:val="BodyText"/>
+      </w:pPr>
+      <w:r>
+        <w:t xml:space="preserve">Gao, J., &amp; Lee, J. D. (2006). Extending the decision field theory to model operators’ reliance on automation in supervisory control of multiple robots.</w:t>
+      </w:r>
+      <w:r>
+        <w:t xml:space="preserve"> </w:t>
+      </w:r>
+      <w:r>
+        <w:rPr>
+          <w:i/>
+          <w:iCs/>
+        </w:rPr>
+        <w:t xml:space="preserve">IEEE Transactions on Systems, Man, and Cybernetics—Part A: Systems and Humans</w:t>
+      </w:r>
+      <w:r>
+        <w:t xml:space="preserve">,</w:t>
+      </w:r>
+      <w:r>
+        <w:t xml:space="preserve"> </w:t>
+      </w:r>
+      <w:r>
+        <w:rPr>
+          <w:i/>
+          <w:iCs/>
+        </w:rPr>
+        <w:t xml:space="preserve">36</w:t>
+      </w:r>
+      <w:r>
+        <w:t xml:space="preserve">(5), 943–959. https://doi.org/10.1109/TSMCA.2006.878984</w:t>
+      </w:r>
+    </w:p>
+    <w:p>
+      <w:pPr>
+        <w:pStyle w:val="BodyText"/>
+      </w:pPr>
+      <w:r>
+        <w:t xml:space="preserve">Goddard, K., Roudsari, A., &amp; Wyatt, J. C. (2012). Automation bias: A systematic review of frequency, effect mediators, and mitigators.</w:t>
+      </w:r>
+      <w:r>
+        <w:t xml:space="preserve"> </w:t>
+      </w:r>
+      <w:r>
+        <w:rPr>
+          <w:i/>
+          <w:iCs/>
+        </w:rPr>
+        <w:t xml:space="preserve">Journal of the American Medical Informatics Association</w:t>
+      </w:r>
+      <w:r>
+        <w:t xml:space="preserve">,</w:t>
+      </w:r>
+      <w:r>
+        <w:t xml:space="preserve"> </w:t>
+      </w:r>
+      <w:r>
+        <w:rPr>
+          <w:i/>
+          <w:iCs/>
+        </w:rPr>
+        <w:t xml:space="preserve">19</w:t>
+      </w:r>
+      <w:r>
+        <w:t xml:space="preserve">(1), 121–127. https://doi.org/10.1136/amiajnl-2011-000089</w:t>
       </w:r>
     </w:p>
     <w:p>
@@ -6705,18 +7920,18 @@
           <wp:inline>
             <wp:extent cx="4954274" cy="3119357"/>
             <wp:effectExtent b="0" l="0" r="0" t="0"/>
-            <wp:docPr descr="Experimental Design" title="" id="45" name="Picture"/>
+            <wp:docPr descr="Experimental Design" title="" id="49" name="Picture"/>
             <a:graphic>
               <a:graphicData uri="http://schemas.openxmlformats.org/drawingml/2006/picture">
                 <pic:pic>
                   <pic:nvPicPr>
-                    <pic:cNvPr descr="../figures/Figure_1_Experimental_Design.png" id="46" name="Picture"/>
+                    <pic:cNvPr descr="../figures/Figure_1_Experimental_Design.png" id="50" name="Picture"/>
                     <pic:cNvPicPr>
                       <a:picLocks noChangeArrowheads="1" noChangeAspect="1"/>
                     </pic:cNvPicPr>
                   </pic:nvPicPr>
                   <pic:blipFill>
-                    <a:blip r:embed="rId44"/>
+                    <a:blip r:embed="rId48"/>
                     <a:stretch>
                       <a:fillRect/>
                     </a:stretch>
@@ -6797,7 +8012,7 @@
           <w:i/>
           <w:iCs/>
         </w:rPr>
-        <w:t xml:space="preserve">LCGA Calibration Gap Trajectories by Class</w:t>
+        <w:t xml:space="preserve">Trust-Reliability Matrix With Chess GMM Trajectories</w:t>
       </w:r>
     </w:p>
     <w:p>
@@ -6807,20 +8022,785 @@
       <w:r>
         <w:drawing>
           <wp:inline>
-            <wp:extent cx="4954274" cy="3578086"/>
+            <wp:extent cx="5334000" cy="5353518"/>
             <wp:effectExtent b="0" l="0" r="0" t="0"/>
-            <wp:docPr descr="LCGA Trajectories" title="" id="48" name="Picture"/>
+            <wp:docPr descr="Trust-Reliability Matrix" title="" id="52" name="Picture"/>
             <a:graphic>
               <a:graphicData uri="http://schemas.openxmlformats.org/drawingml/2006/picture">
                 <pic:pic>
                   <pic:nvPicPr>
-                    <pic:cNvPr descr="../figures/Figure_2_LCGA_Trajectories.png" id="49" name="Picture"/>
+                    <pic:cNvPr descr="../figures/Figure_2_Trust_Reliability_Matrix.png" id="53" name="Picture"/>
                     <pic:cNvPicPr>
                       <a:picLocks noChangeArrowheads="1" noChangeAspect="1"/>
                     </pic:cNvPicPr>
                   </pic:nvPicPr>
                   <pic:blipFill>
-                    <a:blip r:embed="rId47"/>
+                    <a:blip r:embed="rId51"/>
+                    <a:stretch>
+                      <a:fillRect/>
+                    </a:stretch>
+                  </pic:blipFill>
+                  <pic:spPr bwMode="auto">
+                    <a:xfrm>
+                      <a:off x="0" y="0"/>
+                      <a:ext cx="5334000" cy="5353518"/>
+                    </a:xfrm>
+                    <a:prstGeom prst="rect">
+                      <a:avLst/>
+                    </a:prstGeom>
+                    <a:noFill/>
+                    <a:ln w="9525">
+                      <a:noFill/>
+                      <a:headEnd/>
+                      <a:tailEnd/>
+                    </a:ln>
+                  </pic:spPr>
+                </pic:pic>
+              </a:graphicData>
+            </a:graphic>
+          </wp:inline>
+        </w:drawing>
+      </w:r>
+    </w:p>
+    <w:p>
+      <w:pPr>
+        <w:pStyle w:val="ImageCaption"/>
+      </w:pPr>
+      <w:r>
+        <w:t xml:space="preserve">Trust-Reliability Matrix</w:t>
+      </w:r>
+    </w:p>
+    <w:p>
+      <w:pPr>
+        <w:pStyle w:val="BodyText"/>
+      </w:pPr>
+      <w:r>
+        <w:rPr>
+          <w:i/>
+          <w:iCs/>
+        </w:rPr>
+        <w:t xml:space="preserve">Note.</w:t>
+      </w:r>
+      <w:r>
+        <w:t xml:space="preserve"> </w:t>
+      </w:r>
+      <w:r>
+        <w:t xml:space="preserve">The Trust-Reliability Matrix shows the</w:t>
+      </w:r>
+      <w:r>
+        <w:t xml:space="preserve"> </w:t>
+      </w:r>
+      <m:oMath>
+        <m:r>
+          <m:t>T</m:t>
+        </m:r>
+        <m:r>
+          <m:rPr>
+            <m:sty m:val="p"/>
+          </m:rPr>
+          <m:t>×</m:t>
+        </m:r>
+        <m:r>
+          <m:t>R</m:t>
+        </m:r>
+      </m:oMath>
+      <w:r>
+        <w:t xml:space="preserve"> </w:t>
+      </w:r>
+      <w:r>
+        <w:t xml:space="preserve">plane of the Trust Calibration Space, with behavioral trust (</w:t>
+      </w:r>
+      <w:r>
+        <w:rPr>
+          <w:i/>
+          <w:iCs/>
+        </w:rPr>
+        <w:t xml:space="preserve">T</w:t>
+      </w:r>
+      <w:r>
+        <w:t xml:space="preserve">, operationalized as behavioral reliance</w:t>
+      </w:r>
+      <w:r>
+        <w:t xml:space="preserve"> </w:t>
+      </w:r>
+      <w:r>
+        <w:rPr>
+          <w:i/>
+          <w:iCs/>
+        </w:rPr>
+        <w:t xml:space="preserve">R</w:t>
+      </w:r>
+      <w:r>
+        <w:rPr>
+          <w:vertAlign w:val="subscript"/>
+        </w:rPr>
+        <w:t xml:space="preserve">b</w:t>
+      </w:r>
+      <w:r>
+        <w:t xml:space="preserve">) on the vertical axis and AI reliability (</w:t>
+      </w:r>
+      <w:r>
+        <w:rPr>
+          <w:i/>
+          <w:iCs/>
+        </w:rPr>
+        <w:t xml:space="preserve">R</w:t>
+      </w:r>
+      <w:r>
+        <w:t xml:space="preserve">, operationalized as AI accuracy</w:t>
+      </w:r>
+      <w:r>
+        <w:t xml:space="preserve"> </w:t>
+      </w:r>
+      <w:r>
+        <w:rPr>
+          <w:i/>
+          <w:iCs/>
+        </w:rPr>
+        <w:t xml:space="preserve">P</w:t>
+      </w:r>
+      <w:r>
+        <w:t xml:space="preserve">) on the horizontal axis. The diagonal line represents perfect calibration (</w:t>
+      </w:r>
+      <m:oMath>
+        <m:r>
+          <m:t>T</m:t>
+        </m:r>
+        <m:r>
+          <m:rPr>
+            <m:sty m:val="p"/>
+          </m:rPr>
+          <m:t>=</m:t>
+        </m:r>
+        <m:r>
+          <m:t>R</m:t>
+        </m:r>
+      </m:oMath>
+      <w:r>
+        <w:t xml:space="preserve">,</w:t>
+      </w:r>
+      <w:r>
+        <w:t xml:space="preserve"> </w:t>
+      </w:r>
+      <m:oMath>
+        <m:r>
+          <m:t>G</m:t>
+        </m:r>
+        <m:r>
+          <m:rPr>
+            <m:sty m:val="p"/>
+          </m:rPr>
+          <m:t>=</m:t>
+        </m:r>
+        <m:r>
+          <m:t>0</m:t>
+        </m:r>
+      </m:oMath>
+      <w:r>
+        <w:t xml:space="preserve">). Points above the diagonal indicate over-reliance (</w:t>
+      </w:r>
+      <m:oMath>
+        <m:r>
+          <m:t>G</m:t>
+        </m:r>
+        <m:r>
+          <m:rPr>
+            <m:sty m:val="p"/>
+          </m:rPr>
+          <m:t>&gt;</m:t>
+        </m:r>
+        <m:r>
+          <m:t>0</m:t>
+        </m:r>
+      </m:oMath>
+      <w:r>
+        <w:t xml:space="preserve">); points below indicate under-reliance (</w:t>
+      </w:r>
+      <m:oMath>
+        <m:r>
+          <m:t>G</m:t>
+        </m:r>
+        <m:r>
+          <m:rPr>
+            <m:sty m:val="p"/>
+          </m:rPr>
+          <m:t>&lt;</m:t>
+        </m:r>
+        <m:r>
+          <m:t>0</m:t>
+        </m:r>
+      </m:oMath>
+      <w:r>
+        <w:t xml:space="preserve">). GMM class trajectories are projected into this plane, illustrating how C1 classes (Catastrophic, Convergent) move from the calibrated region into over-reliance, while C2 classes move from under-reliance toward the diagonal. The asymmetric paths between C1 and C2 trajectories reveal trust hysteresis.</w:t>
+      </w:r>
+    </w:p>
+    <w:p>
+      <w:r>
+        <w:pict>
+          <v:rect style="width:0;height:1.5pt" o:hralign="center" o:hrstd="t" o:hr="t"/>
+        </w:pict>
+      </w:r>
+    </w:p>
+    <w:p>
+      <w:pPr>
+        <w:pStyle w:val="FirstParagraph"/>
+      </w:pPr>
+      <w:r>
+        <w:rPr>
+          <w:b/>
+          <w:bCs/>
+        </w:rPr>
+        <w:t xml:space="preserve">Figure 3</w:t>
+      </w:r>
+    </w:p>
+    <w:p>
+      <w:pPr>
+        <w:pStyle w:val="BodyText"/>
+      </w:pPr>
+      <w:r>
+        <w:rPr>
+          <w:i/>
+          <w:iCs/>
+        </w:rPr>
+        <w:t xml:space="preserve">Three-Dimensional Trust Calibration Trajectories in the</w:t>
+      </w:r>
+      <w:r>
+        <w:rPr>
+          <w:i/>
+          <w:iCs/>
+        </w:rPr>
+        <w:t xml:space="preserve"> </w:t>
+      </w:r>
+      <m:oMath>
+        <m:r>
+          <m:t>T</m:t>
+        </m:r>
+        <m:r>
+          <m:rPr>
+            <m:sty m:val="p"/>
+          </m:rPr>
+          <m:t>×</m:t>
+        </m:r>
+        <m:r>
+          <m:t>R</m:t>
+        </m:r>
+        <m:r>
+          <m:rPr>
+            <m:sty m:val="p"/>
+          </m:rPr>
+          <m:t>×</m:t>
+        </m:r>
+        <m:r>
+          <m:t>τ</m:t>
+        </m:r>
+      </m:oMath>
+      <w:r>
+        <w:rPr>
+          <w:i/>
+          <w:iCs/>
+        </w:rPr>
+        <w:t xml:space="preserve"> </w:t>
+      </w:r>
+      <w:r>
+        <w:rPr>
+          <w:i/>
+          <w:iCs/>
+        </w:rPr>
+        <w:t xml:space="preserve">Space</w:t>
+      </w:r>
+    </w:p>
+    <w:p>
+      <w:pPr>
+        <w:pStyle w:val="CaptionedFigure"/>
+      </w:pPr>
+      <w:r>
+        <w:drawing>
+          <wp:inline>
+            <wp:extent cx="5334000" cy="5123610"/>
+            <wp:effectExtent b="0" l="0" r="0" t="0"/>
+            <wp:docPr descr="3D Trust Trajectory" title="" id="55" name="Picture"/>
+            <a:graphic>
+              <a:graphicData uri="http://schemas.openxmlformats.org/drawingml/2006/picture">
+                <pic:pic>
+                  <pic:nvPicPr>
+                    <pic:cNvPr descr="../figures/Figure_3_3D_Trust_Trajectory.png" id="56" name="Picture"/>
+                    <pic:cNvPicPr>
+                      <a:picLocks noChangeArrowheads="1" noChangeAspect="1"/>
+                    </pic:cNvPicPr>
+                  </pic:nvPicPr>
+                  <pic:blipFill>
+                    <a:blip r:embed="rId54"/>
+                    <a:stretch>
+                      <a:fillRect/>
+                    </a:stretch>
+                  </pic:blipFill>
+                  <pic:spPr bwMode="auto">
+                    <a:xfrm>
+                      <a:off x="0" y="0"/>
+                      <a:ext cx="5334000" cy="5123610"/>
+                    </a:xfrm>
+                    <a:prstGeom prst="rect">
+                      <a:avLst/>
+                    </a:prstGeom>
+                    <a:noFill/>
+                    <a:ln w="9525">
+                      <a:noFill/>
+                      <a:headEnd/>
+                      <a:tailEnd/>
+                    </a:ln>
+                  </pic:spPr>
+                </pic:pic>
+              </a:graphicData>
+            </a:graphic>
+          </wp:inline>
+        </w:drawing>
+      </w:r>
+    </w:p>
+    <w:p>
+      <w:pPr>
+        <w:pStyle w:val="ImageCaption"/>
+      </w:pPr>
+      <w:r>
+        <w:t xml:space="preserve">3D Trust Trajectory</w:t>
+      </w:r>
+    </w:p>
+    <w:p>
+      <w:pPr>
+        <w:pStyle w:val="BodyText"/>
+      </w:pPr>
+      <w:r>
+        <w:rPr>
+          <w:i/>
+          <w:iCs/>
+        </w:rPr>
+        <w:t xml:space="preserve">Note.</w:t>
+      </w:r>
+      <w:r>
+        <w:t xml:space="preserve"> </w:t>
+      </w:r>
+      <w:r>
+        <w:t xml:space="preserve">Three-dimensional trajectories of the six GMM classes through the Trust Calibration Space</w:t>
+      </w:r>
+      <w:r>
+        <w:t xml:space="preserve"> </w:t>
+      </w:r>
+      <m:oMath>
+        <m:r>
+          <m:rPr>
+            <m:scr m:val="script"/>
+            <m:sty m:val="p"/>
+          </m:rPr>
+          <m:t>S</m:t>
+        </m:r>
+        <m:r>
+          <m:rPr>
+            <m:sty m:val="p"/>
+          </m:rPr>
+          <m:t>=</m:t>
+        </m:r>
+        <m:r>
+          <m:rPr>
+            <m:sty m:val="p"/>
+          </m:rPr>
+          <m:t>[</m:t>
+        </m:r>
+        <m:r>
+          <m:t>0</m:t>
+        </m:r>
+        <m:r>
+          <m:rPr>
+            <m:sty m:val="p"/>
+          </m:rPr>
+          <m:t>,</m:t>
+        </m:r>
+        <m:r>
+          <m:t>1</m:t>
+        </m:r>
+        <m:r>
+          <m:rPr>
+            <m:sty m:val="p"/>
+          </m:rPr>
+          <m:t>]</m:t>
+        </m:r>
+        <m:r>
+          <m:rPr>
+            <m:sty m:val="p"/>
+          </m:rPr>
+          <m:t>×</m:t>
+        </m:r>
+        <m:r>
+          <m:rPr>
+            <m:sty m:val="p"/>
+          </m:rPr>
+          <m:t>[</m:t>
+        </m:r>
+        <m:r>
+          <m:t>0</m:t>
+        </m:r>
+        <m:r>
+          <m:rPr>
+            <m:sty m:val="p"/>
+          </m:rPr>
+          <m:t>,</m:t>
+        </m:r>
+        <m:r>
+          <m:t>1</m:t>
+        </m:r>
+        <m:r>
+          <m:rPr>
+            <m:sty m:val="p"/>
+          </m:rPr>
+          <m:t>]</m:t>
+        </m:r>
+        <m:r>
+          <m:rPr>
+            <m:sty m:val="p"/>
+          </m:rPr>
+          <m:t>×</m:t>
+        </m:r>
+        <m:sSup>
+          <m:e>
+            <m:r>
+              <m:rPr>
+                <m:scr m:val="double-struck"/>
+                <m:sty m:val="p"/>
+              </m:rPr>
+              <m:t>Z</m:t>
+            </m:r>
+          </m:e>
+          <m:sup>
+            <m:r>
+              <m:rPr>
+                <m:sty m:val="p"/>
+              </m:rPr>
+              <m:t>+</m:t>
+            </m:r>
+          </m:sup>
+        </m:sSup>
+      </m:oMath>
+      <w:r>
+        <w:t xml:space="preserve">. The</w:t>
+      </w:r>
+      <w:r>
+        <w:t xml:space="preserve"> </w:t>
+      </w:r>
+      <w:r>
+        <w:rPr>
+          <w:i/>
+          <w:iCs/>
+        </w:rPr>
+        <w:t xml:space="preserve">x</w:t>
+      </w:r>
+      <w:r>
+        <w:t xml:space="preserve">-axis represents AI reliability (</w:t>
+      </w:r>
+      <w:r>
+        <w:rPr>
+          <w:i/>
+          <w:iCs/>
+        </w:rPr>
+        <w:t xml:space="preserve">R</w:t>
+      </w:r>
+      <w:r>
+        <w:t xml:space="preserve">), the</w:t>
+      </w:r>
+      <w:r>
+        <w:t xml:space="preserve"> </w:t>
+      </w:r>
+      <w:r>
+        <w:rPr>
+          <w:i/>
+          <w:iCs/>
+        </w:rPr>
+        <w:t xml:space="preserve">y</w:t>
+      </w:r>
+      <w:r>
+        <w:t xml:space="preserve">-axis represents behavioral trust (</w:t>
+      </w:r>
+      <w:r>
+        <w:rPr>
+          <w:i/>
+          <w:iCs/>
+        </w:rPr>
+        <w:t xml:space="preserve">T</w:t>
+      </w:r>
+      <w:r>
+        <w:t xml:space="preserve">), and the</w:t>
+      </w:r>
+      <w:r>
+        <w:t xml:space="preserve"> </w:t>
+      </w:r>
+      <w:r>
+        <w:rPr>
+          <w:i/>
+          <w:iCs/>
+        </w:rPr>
+        <w:t xml:space="preserve">z</w:t>
+      </w:r>
+      <w:r>
+        <w:t xml:space="preserve">-axis represents time (</w:t>
+      </w:r>
+      <m:oMath>
+        <m:r>
+          <m:t>τ</m:t>
+        </m:r>
+      </m:oMath>
+      <w:r>
+        <w:t xml:space="preserve">, Windows 1–6). The transparent diagonal plane marks perfect calibration (</w:t>
+      </w:r>
+      <m:oMath>
+        <m:r>
+          <m:t>T</m:t>
+        </m:r>
+        <m:r>
+          <m:rPr>
+            <m:sty m:val="p"/>
+          </m:rPr>
+          <m:t>=</m:t>
+        </m:r>
+        <m:r>
+          <m:t>R</m:t>
+        </m:r>
+      </m:oMath>
+      <w:r>
+        <w:t xml:space="preserve">). C1 trajectories (Catastrophic, Convergent) begin near the calibrated plane and diverge above it after the reliability switch at Window 5. C2 trajectories begin below the plane and approach it at different rates. The Catastrophic trajectory remains far above the plane post-switch, while the Convergent trajectory returns near it.</w:t>
+      </w:r>
+    </w:p>
+    <w:p>
+      <w:r>
+        <w:pict>
+          <v:rect style="width:0;height:1.5pt" o:hralign="center" o:hrstd="t" o:hr="t"/>
+        </w:pict>
+      </w:r>
+    </w:p>
+    <w:p>
+      <w:pPr>
+        <w:pStyle w:val="FirstParagraph"/>
+      </w:pPr>
+      <w:r>
+        <w:rPr>
+          <w:b/>
+          <w:bCs/>
+        </w:rPr>
+        <w:t xml:space="preserve">Figure 4</w:t>
+      </w:r>
+    </w:p>
+    <w:p>
+      <w:pPr>
+        <w:pStyle w:val="BodyText"/>
+      </w:pPr>
+      <w:r>
+        <w:rPr>
+          <w:i/>
+          <w:iCs/>
+        </w:rPr>
+        <w:t xml:space="preserve">Theoretical Predictions for Five Trust Calibration Trajectory Patterns in the Chess Context</w:t>
+      </w:r>
+    </w:p>
+    <w:p>
+      <w:pPr>
+        <w:pStyle w:val="CaptionedFigure"/>
+      </w:pPr>
+      <w:r>
+        <w:drawing>
+          <wp:inline>
+            <wp:extent cx="5334000" cy="3446446"/>
+            <wp:effectExtent b="0" l="0" r="0" t="0"/>
+            <wp:docPr descr="Theoretical Predictions" title="" id="58" name="Picture"/>
+            <a:graphic>
+              <a:graphicData uri="http://schemas.openxmlformats.org/drawingml/2006/picture">
+                <pic:pic>
+                  <pic:nvPicPr>
+                    <pic:cNvPr descr="../figures/Figure_4_Theoretical_Predictions.png" id="59" name="Picture"/>
+                    <pic:cNvPicPr>
+                      <a:picLocks noChangeArrowheads="1" noChangeAspect="1"/>
+                    </pic:cNvPicPr>
+                  </pic:nvPicPr>
+                  <pic:blipFill>
+                    <a:blip r:embed="rId57"/>
+                    <a:stretch>
+                      <a:fillRect/>
+                    </a:stretch>
+                  </pic:blipFill>
+                  <pic:spPr bwMode="auto">
+                    <a:xfrm>
+                      <a:off x="0" y="0"/>
+                      <a:ext cx="5334000" cy="3446446"/>
+                    </a:xfrm>
+                    <a:prstGeom prst="rect">
+                      <a:avLst/>
+                    </a:prstGeom>
+                    <a:noFill/>
+                    <a:ln w="9525">
+                      <a:noFill/>
+                      <a:headEnd/>
+                      <a:tailEnd/>
+                    </a:ln>
+                  </pic:spPr>
+                </pic:pic>
+              </a:graphicData>
+            </a:graphic>
+          </wp:inline>
+        </w:drawing>
+      </w:r>
+    </w:p>
+    <w:p>
+      <w:pPr>
+        <w:pStyle w:val="ImageCaption"/>
+      </w:pPr>
+      <w:r>
+        <w:t xml:space="preserve">Theoretical Predictions</w:t>
+      </w:r>
+    </w:p>
+    <w:p>
+      <w:pPr>
+        <w:pStyle w:val="BodyText"/>
+      </w:pPr>
+      <w:r>
+        <w:rPr>
+          <w:i/>
+          <w:iCs/>
+        </w:rPr>
+        <w:t xml:space="preserve">Note.</w:t>
+      </w:r>
+      <w:r>
+        <w:t xml:space="preserve"> </w:t>
+      </w:r>
+      <w:r>
+        <w:t xml:space="preserve">Theoretical predictions for the five trajectory patterns derived from the Bayesian Trust Update Model, illustrated in the context of the chess puzzle experimental design. Each panel shows the predicted behavioral trust trajectory (</w:t>
+      </w:r>
+      <w:r>
+        <w:rPr>
+          <w:i/>
+          <w:iCs/>
+        </w:rPr>
+        <w:t xml:space="preserve">T</w:t>
+      </w:r>
+      <w:r>
+        <w:rPr>
+          <w:i/>
+          <w:iCs/>
+          <w:vertAlign w:val="subscript"/>
+        </w:rPr>
+        <w:t xml:space="preserve">t</w:t>
+      </w:r>
+      <w:r>
+        <w:t xml:space="preserve">) relative to AI reliability (</w:t>
+      </w:r>
+      <w:r>
+        <w:rPr>
+          <w:i/>
+          <w:iCs/>
+        </w:rPr>
+        <w:t xml:space="preserve">R</w:t>
+      </w:r>
+      <w:r>
+        <w:rPr>
+          <w:i/>
+          <w:iCs/>
+          <w:vertAlign w:val="subscript"/>
+        </w:rPr>
+        <w:t xml:space="preserve">t</w:t>
+      </w:r>
+      <w:r>
+        <w:t xml:space="preserve">) across six windows, given different configurations of the asymmetric learning rate parameters (</w:t>
+      </w:r>
+      <m:oMath>
+        <m:sSup>
+          <m:e>
+            <m:r>
+              <m:t>α</m:t>
+            </m:r>
+          </m:e>
+          <m:sup>
+            <m:r>
+              <m:rPr>
+                <m:sty m:val="p"/>
+              </m:rPr>
+              <m:t>+</m:t>
+            </m:r>
+          </m:sup>
+        </m:sSup>
+      </m:oMath>
+      <w:r>
+        <w:t xml:space="preserve">,</w:t>
+      </w:r>
+      <w:r>
+        <w:t xml:space="preserve"> </w:t>
+      </w:r>
+      <m:oMath>
+        <m:sSup>
+          <m:e>
+            <m:r>
+              <m:t>α</m:t>
+            </m:r>
+          </m:e>
+          <m:sup>
+            <m:r>
+              <m:rPr>
+                <m:sty m:val="p"/>
+              </m:rPr>
+              <m:t>−</m:t>
+            </m:r>
+          </m:sup>
+        </m:sSup>
+      </m:oMath>
+      <w:r>
+        <w:t xml:space="preserve">). The vertical dashed line marks the reliability switch between Windows 4 and 5.</w:t>
+      </w:r>
+    </w:p>
+    <w:p>
+      <w:r>
+        <w:pict>
+          <v:rect style="width:0;height:1.5pt" o:hralign="center" o:hrstd="t" o:hr="t"/>
+        </w:pict>
+      </w:r>
+    </w:p>
+    <w:p>
+      <w:pPr>
+        <w:pStyle w:val="FirstParagraph"/>
+      </w:pPr>
+      <w:r>
+        <w:rPr>
+          <w:b/>
+          <w:bCs/>
+        </w:rPr>
+        <w:t xml:space="preserve">Figure 5</w:t>
+      </w:r>
+    </w:p>
+    <w:p>
+      <w:pPr>
+        <w:pStyle w:val="BodyText"/>
+      </w:pPr>
+      <w:r>
+        <w:rPr>
+          <w:i/>
+          <w:iCs/>
+        </w:rPr>
+        <w:t xml:space="preserve">LCGA Calibration Gap Trajectories by Class</w:t>
+      </w:r>
+    </w:p>
+    <w:p>
+      <w:pPr>
+        <w:pStyle w:val="CaptionedFigure"/>
+      </w:pPr>
+      <w:r>
+        <w:drawing>
+          <wp:inline>
+            <wp:extent cx="4954274" cy="3578086"/>
+            <wp:effectExtent b="0" l="0" r="0" t="0"/>
+            <wp:docPr descr="LCGA Trajectories" title="" id="61" name="Picture"/>
+            <a:graphic>
+              <a:graphicData uri="http://schemas.openxmlformats.org/drawingml/2006/picture">
+                <pic:pic>
+                  <pic:nvPicPr>
+                    <pic:cNvPr descr="../figures/Figure_2_LCGA_Trajectories.png" id="62" name="Picture"/>
+                    <pic:cNvPicPr>
+                      <a:picLocks noChangeArrowheads="1" noChangeAspect="1"/>
+                    </pic:cNvPicPr>
+                  </pic:nvPicPr>
+                  <pic:blipFill>
+                    <a:blip r:embed="rId60"/>
                     <a:stretch>
                       <a:fillRect/>
                     </a:stretch>
@@ -6928,7 +8908,7 @@
           <w:b/>
           <w:bCs/>
         </w:rPr>
-        <w:t xml:space="preserve">Figure 3</w:t>
+        <w:t xml:space="preserve">Figure 6</w:t>
       </w:r>
     </w:p>
     <w:p>
@@ -6952,18 +8932,18 @@
           <wp:inline>
             <wp:extent cx="5334000" cy="3224031"/>
             <wp:effectExtent b="0" l="0" r="0" t="0"/>
-            <wp:docPr descr="GMM Six-Class Profiles" title="" id="51" name="Picture"/>
+            <wp:docPr descr="GMM Six-Class Profiles" title="" id="64" name="Picture"/>
             <a:graphic>
               <a:graphicData uri="http://schemas.openxmlformats.org/drawingml/2006/picture">
                 <pic:pic>
                   <pic:nvPicPr>
-                    <pic:cNvPr descr="../figures/Figure_3_GMM_Six_Class_Profiles.png" id="52" name="Picture"/>
+                    <pic:cNvPr descr="../figures/Figure_3_GMM_Six_Class_Profiles.png" id="65" name="Picture"/>
                     <pic:cNvPicPr>
                       <a:picLocks noChangeArrowheads="1" noChangeAspect="1"/>
                     </pic:cNvPicPr>
                   </pic:nvPicPr>
                   <pic:blipFill>
-                    <a:blip r:embed="rId50"/>
+                    <a:blip r:embed="rId63"/>
                     <a:stretch>
                       <a:fillRect/>
                     </a:stretch>
@@ -7048,7 +9028,7 @@
           <w:b/>
           <w:bCs/>
         </w:rPr>
-        <w:t xml:space="preserve">Figure 4</w:t>
+        <w:t xml:space="preserve">Figure 7</w:t>
       </w:r>
     </w:p>
     <w:p>
@@ -7072,18 +9052,18 @@
           <wp:inline>
             <wp:extent cx="4544476" cy="4495545"/>
             <wp:effectExtent b="0" l="0" r="0" t="0"/>
-            <wp:docPr descr="Theoretical Pattern Map" title="" id="54" name="Picture"/>
+            <wp:docPr descr="Theoretical Pattern Map" title="" id="67" name="Picture"/>
             <a:graphic>
               <a:graphicData uri="http://schemas.openxmlformats.org/drawingml/2006/picture">
                 <pic:pic>
                   <pic:nvPicPr>
-                    <pic:cNvPr descr="../figures/Figure_4_Theoretical_Pattern_Map.png" id="55" name="Picture"/>
+                    <pic:cNvPr descr="../figures/Figure_4_Theoretical_Pattern_Map.png" id="68" name="Picture"/>
                     <pic:cNvPicPr>
                       <a:picLocks noChangeArrowheads="1" noChangeAspect="1"/>
                     </pic:cNvPicPr>
                   </pic:nvPicPr>
                   <pic:blipFill>
-                    <a:blip r:embed="rId53"/>
+                    <a:blip r:embed="rId66"/>
                     <a:stretch>
                       <a:fillRect/>
                     </a:stretch>
@@ -7195,7 +9175,7 @@
           <w:b/>
           <w:bCs/>
         </w:rPr>
-        <w:t xml:space="preserve">Figure 5</w:t>
+        <w:t xml:space="preserve">Figure 8</w:t>
       </w:r>
     </w:p>
     <w:p>
@@ -7219,18 +9199,18 @@
           <wp:inline>
             <wp:extent cx="5334000" cy="2315829"/>
             <wp:effectExtent b="0" l="0" r="0" t="0"/>
-            <wp:docPr descr="Cross-Method Comparison" title="" id="57" name="Picture"/>
+            <wp:docPr descr="Cross-Method Comparison" title="" id="70" name="Picture"/>
             <a:graphic>
               <a:graphicData uri="http://schemas.openxmlformats.org/drawingml/2006/picture">
                 <pic:pic>
                   <pic:nvPicPr>
-                    <pic:cNvPr descr="../figures/Figure_5_Cross_Method_Comparison.png" id="58" name="Picture"/>
+                    <pic:cNvPr descr="../figures/Figure_5_Cross_Method_Comparison.png" id="71" name="Picture"/>
                     <pic:cNvPicPr>
                       <a:picLocks noChangeArrowheads="1" noChangeAspect="1"/>
                     </pic:cNvPicPr>
                   </pic:nvPicPr>
                   <pic:blipFill>
-                    <a:blip r:embed="rId56"/>
+                    <a:blip r:embed="rId69"/>
                     <a:stretch>
                       <a:fillRect/>
                     </a:stretch>
@@ -7283,7 +9263,7 @@
         <w:t xml:space="preserve">Heatmap showing the cross-tabulation of LCGA (two classes) and GMM (six classes) assignments. Adjusted Rand Index (ARI) = .362. LCGA captures condition-level macro-structure while GMM captures within-condition micro-heterogeneity.</w:t>
       </w:r>
     </w:p>
-    <w:bookmarkEnd w:id="59"/>
+    <w:bookmarkEnd w:id="72"/>
     <w:sectPr>
       <w:footnotePr>
         <w:numRestart w:val="eachSect"/>
@@ -7394,6 +9374,109 @@
       </w:pPr>
     </w:lvl>
   </w:abstractNum>
+  <w:abstractNum w:abstractNumId="991">
+    <w:nsid w:val="0000A991"/>
+    <w:multiLevelType w:val="multilevel"/>
+    <w:lvl w:ilvl="0">
+      <w:numFmt w:val="bullet"/>
+      <w:lvlText w:val=""/>
+      <w:lvlJc w:val="left"/>
+      <w:pPr>
+        <w:ind w:left="720" w:hanging="360"/>
+      </w:pPr>
+      <w:rPr>
+        <w:rFonts w:ascii="Symbol" w:hAnsi="Symbol" w:cs="Symbol" w:hint="default"/>
+      </w:rPr>
+    </w:lvl>
+    <w:lvl w:ilvl="1">
+      <w:numFmt w:val="bullet"/>
+      <w:lvlText w:val="o"/>
+      <w:lvlJc w:val="left"/>
+      <w:pPr>
+        <w:ind w:left="1440" w:hanging="360"/>
+      </w:pPr>
+      <w:rPr>
+        <w:rFonts w:ascii="Courier New" w:hAnsi="Courier New" w:cs="Courier New" w:hint="default"/>
+      </w:rPr>
+    </w:lvl>
+    <w:lvl w:ilvl="2">
+      <w:numFmt w:val="bullet"/>
+      <w:lvlText w:val=""/>
+      <w:lvlJc w:val="left"/>
+      <w:pPr>
+        <w:ind w:left="2160" w:hanging="360"/>
+      </w:pPr>
+      <w:rPr>
+        <w:rFonts w:ascii="Wingdings" w:hAnsi="Wingdings" w:cs="Wingdings" w:hint="default"/>
+      </w:rPr>
+    </w:lvl>
+    <w:lvl w:ilvl="3">
+      <w:numFmt w:val="bullet"/>
+      <w:lvlText w:val=""/>
+      <w:lvlJc w:val="left"/>
+      <w:pPr>
+        <w:ind w:left="2880" w:hanging="360"/>
+      </w:pPr>
+      <w:rPr>
+        <w:rFonts w:ascii="Symbol" w:hAnsi="Symbol" w:cs="Symbol" w:hint="default"/>
+      </w:rPr>
+    </w:lvl>
+    <w:lvl w:ilvl="4">
+      <w:numFmt w:val="bullet"/>
+      <w:lvlText w:val="o"/>
+      <w:lvlJc w:val="left"/>
+      <w:pPr>
+        <w:ind w:left="3600" w:hanging="360"/>
+      </w:pPr>
+      <w:rPr>
+        <w:rFonts w:ascii="Courier New" w:hAnsi="Courier New" w:cs="Courier New" w:hint="default"/>
+      </w:rPr>
+    </w:lvl>
+    <w:lvl w:ilvl="5">
+      <w:numFmt w:val="bullet"/>
+      <w:lvlText w:val=""/>
+      <w:lvlJc w:val="left"/>
+      <w:pPr>
+        <w:ind w:left="4320" w:hanging="360"/>
+      </w:pPr>
+      <w:rPr>
+        <w:rFonts w:ascii="Wingdings" w:hAnsi="Wingdings" w:cs="Wingdings" w:hint="default"/>
+      </w:rPr>
+    </w:lvl>
+    <w:lvl w:ilvl="6">
+      <w:numFmt w:val="bullet"/>
+      <w:lvlText w:val=""/>
+      <w:lvlJc w:val="left"/>
+      <w:pPr>
+        <w:ind w:left="5040" w:hanging="360"/>
+      </w:pPr>
+      <w:rPr>
+        <w:rFonts w:ascii="Symbol" w:hAnsi="Symbol" w:cs="Symbol" w:hint="default"/>
+      </w:rPr>
+    </w:lvl>
+    <w:lvl w:ilvl="7">
+      <w:numFmt w:val="bullet"/>
+      <w:lvlText w:val="o"/>
+      <w:lvlJc w:val="left"/>
+      <w:pPr>
+        <w:ind w:left="5760" w:hanging="360"/>
+      </w:pPr>
+      <w:rPr>
+        <w:rFonts w:ascii="Courier New" w:hAnsi="Courier New" w:cs="Courier New" w:hint="default"/>
+      </w:rPr>
+    </w:lvl>
+    <w:lvl w:ilvl="8">
+      <w:numFmt w:val="bullet"/>
+      <w:lvlText w:val=""/>
+      <w:lvlJc w:val="left"/>
+      <w:pPr>
+        <w:ind w:left="6480" w:hanging="360"/>
+      </w:pPr>
+      <w:rPr>
+        <w:rFonts w:ascii="Wingdings" w:hAnsi="Wingdings" w:cs="Wingdings" w:hint="default"/>
+      </w:rPr>
+    </w:lvl>
+  </w:abstractNum>
   <w:abstractNum w:abstractNumId="99411">
     <w:nsid w:val="00A99411"/>
     <w:multiLevelType w:val="multilevel"/>
@@ -7479,113 +9562,16 @@
       </w:pPr>
     </w:lvl>
   </w:abstractNum>
-  <w:abstractNum w:abstractNumId="991">
-    <w:nsid w:val="0000A991"/>
-    <w:multiLevelType w:val="multilevel"/>
-    <w:lvl w:ilvl="0">
-      <w:numFmt w:val="bullet"/>
-      <w:lvlText w:val=""/>
-      <w:lvlJc w:val="left"/>
-      <w:pPr>
-        <w:ind w:left="720" w:hanging="360"/>
-      </w:pPr>
-      <w:rPr>
-        <w:rFonts w:ascii="Symbol" w:hAnsi="Symbol" w:cs="Symbol" w:hint="default"/>
-      </w:rPr>
-    </w:lvl>
-    <w:lvl w:ilvl="1">
-      <w:numFmt w:val="bullet"/>
-      <w:lvlText w:val="o"/>
-      <w:lvlJc w:val="left"/>
-      <w:pPr>
-        <w:ind w:left="1440" w:hanging="360"/>
-      </w:pPr>
-      <w:rPr>
-        <w:rFonts w:ascii="Courier New" w:hAnsi="Courier New" w:cs="Courier New" w:hint="default"/>
-      </w:rPr>
-    </w:lvl>
-    <w:lvl w:ilvl="2">
-      <w:numFmt w:val="bullet"/>
-      <w:lvlText w:val=""/>
-      <w:lvlJc w:val="left"/>
-      <w:pPr>
-        <w:ind w:left="2160" w:hanging="360"/>
-      </w:pPr>
-      <w:rPr>
-        <w:rFonts w:ascii="Wingdings" w:hAnsi="Wingdings" w:cs="Wingdings" w:hint="default"/>
-      </w:rPr>
-    </w:lvl>
-    <w:lvl w:ilvl="3">
-      <w:numFmt w:val="bullet"/>
-      <w:lvlText w:val=""/>
-      <w:lvlJc w:val="left"/>
-      <w:pPr>
-        <w:ind w:left="2880" w:hanging="360"/>
-      </w:pPr>
-      <w:rPr>
-        <w:rFonts w:ascii="Symbol" w:hAnsi="Symbol" w:cs="Symbol" w:hint="default"/>
-      </w:rPr>
-    </w:lvl>
-    <w:lvl w:ilvl="4">
-      <w:numFmt w:val="bullet"/>
-      <w:lvlText w:val="o"/>
-      <w:lvlJc w:val="left"/>
-      <w:pPr>
-        <w:ind w:left="3600" w:hanging="360"/>
-      </w:pPr>
-      <w:rPr>
-        <w:rFonts w:ascii="Courier New" w:hAnsi="Courier New" w:cs="Courier New" w:hint="default"/>
-      </w:rPr>
-    </w:lvl>
-    <w:lvl w:ilvl="5">
-      <w:numFmt w:val="bullet"/>
-      <w:lvlText w:val=""/>
-      <w:lvlJc w:val="left"/>
-      <w:pPr>
-        <w:ind w:left="4320" w:hanging="360"/>
-      </w:pPr>
-      <w:rPr>
-        <w:rFonts w:ascii="Wingdings" w:hAnsi="Wingdings" w:cs="Wingdings" w:hint="default"/>
-      </w:rPr>
-    </w:lvl>
-    <w:lvl w:ilvl="6">
-      <w:numFmt w:val="bullet"/>
-      <w:lvlText w:val=""/>
-      <w:lvlJc w:val="left"/>
-      <w:pPr>
-        <w:ind w:left="5040" w:hanging="360"/>
-      </w:pPr>
-      <w:rPr>
-        <w:rFonts w:ascii="Symbol" w:hAnsi="Symbol" w:cs="Symbol" w:hint="default"/>
-      </w:rPr>
-    </w:lvl>
-    <w:lvl w:ilvl="7">
-      <w:numFmt w:val="bullet"/>
-      <w:lvlText w:val="o"/>
-      <w:lvlJc w:val="left"/>
-      <w:pPr>
-        <w:ind w:left="5760" w:hanging="360"/>
-      </w:pPr>
-      <w:rPr>
-        <w:rFonts w:ascii="Courier New" w:hAnsi="Courier New" w:cs="Courier New" w:hint="default"/>
-      </w:rPr>
-    </w:lvl>
-    <w:lvl w:ilvl="8">
-      <w:numFmt w:val="bullet"/>
-      <w:lvlText w:val=""/>
-      <w:lvlJc w:val="left"/>
-      <w:pPr>
-        <w:ind w:left="6480" w:hanging="360"/>
-      </w:pPr>
-      <w:rPr>
-        <w:rFonts w:ascii="Wingdings" w:hAnsi="Wingdings" w:cs="Wingdings" w:hint="default"/>
-      </w:rPr>
-    </w:lvl>
-  </w:abstractNum>
   <w:num w:numId="1000">
     <w:abstractNumId w:val="990"/>
   </w:num>
   <w:num w:numId="1001">
+    <w:abstractNumId w:val="991"/>
+  </w:num>
+  <w:num w:numId="1002">
+    <w:abstractNumId w:val="991"/>
+  </w:num>
+  <w:num w:numId="1003">
     <w:abstractNumId w:val="99411"/>
     <w:lvlOverride w:ilvl="0">
       <w:startOverride w:val="1"/>
@@ -7615,10 +9601,10 @@
       <w:startOverride w:val="1"/>
     </w:lvlOverride>
   </w:num>
-  <w:num w:numId="1002">
+  <w:num w:numId="1004">
     <w:abstractNumId w:val="991"/>
   </w:num>
-  <w:num w:numId="1003">
+  <w:num w:numId="1005">
     <w:abstractNumId w:val="991"/>
   </w:num>
 </w:numbering>

</xml_diff>